<commit_message>
Add detailed documentation for the CAS join form data flow and Zoho CRM integration
Updates documentation to include worked examples, privacy compliance details, admin remediation tools, troubleshooting, and glossary for the CAS join form data flow and Zoho CRM integration.

Replit-Commit-Author: Agent
Replit-Commit-Session-Id: ef7bf022-0b3a-4156-9c38-2b98b837c1d1
Replit-Commit-Checkpoint-Type: full_checkpoint
Replit-Commit-Event-Id: 1ebece82-4e6e-4dc3-9378-5e57a2e4137b
Replit-Commit-Screenshot-Url: https://storage.googleapis.com/screenshot-production-us-central1/e9fe007f-c11f-42ca-a1dd-347ccc032e17/ef7bf022-0b3a-4156-9c38-2b98b837c1d1/oNpQeAE
Replit-Helium-Checkpoint-Created: true
</commit_message>
<xml_diff>
--- a/docs/CAS-Join-Form-Data-Flow.docx
+++ b/docs/CAS-Join-Form-Data-Flow.docx
@@ -272,7 +272,7 @@
       </w:r>
     </w:p>
     <w:bookmarkEnd w:id="20"/>
-    <w:bookmarkStart w:id="25" w:name="part-1-plain-language-summary"/>
+    <w:bookmarkStart w:id="26" w:name="part-1-plain-language-summary"/>
     <w:p>
       <w:pPr>
         <w:pStyle w:val="Heading1"/>
@@ -1033,6 +1033,614 @@
         </w:tc>
       </w:tr>
     </w:tbl>
+    <w:bookmarkEnd w:id="24"/>
+    <w:bookmarkStart w:id="25" w:name="worked-examples"/>
+    <w:p>
+      <w:pPr>
+        <w:pStyle w:val="Heading2"/>
+      </w:pPr>
+      <w:r>
+        <w:t xml:space="preserve">Worked examples</w:t>
+      </w:r>
+    </w:p>
+    <w:p>
+      <w:pPr>
+        <w:pStyle w:val="FirstParagraph"/>
+      </w:pPr>
+      <w:r>
+        <w:rPr>
+          <w:b/>
+          <w:bCs/>
+        </w:rPr>
+        <w:t xml:space="preserve">Example 1 — A nurse joins CANN</w:t>
+      </w:r>
+    </w:p>
+    <w:p>
+      <w:pPr>
+        <w:pStyle w:val="BodyText"/>
+      </w:pPr>
+      <w:r>
+        <w:t xml:space="preserve">Maria, a cardiology nurse in Halifax, answers</w:t>
+      </w:r>
+      <w:r>
+        <w:t xml:space="preserve"> </w:t>
+      </w:r>
+      <w:r>
+        <w:rPr>
+          <w:i/>
+          <w:iCs/>
+        </w:rPr>
+        <w:t xml:space="preserve">No</w:t>
+      </w:r>
+      <w:r>
+        <w:t xml:space="preserve"> </w:t>
+      </w:r>
+      <w:r>
+        <w:t xml:space="preserve">to CAS membership but</w:t>
+      </w:r>
+      <w:r>
+        <w:t xml:space="preserve"> </w:t>
+      </w:r>
+      <w:r>
+        <w:rPr>
+          <w:i/>
+          <w:iCs/>
+        </w:rPr>
+        <w:t xml:space="preserve">Yes</w:t>
+      </w:r>
+      <w:r>
+        <w:t xml:space="preserve"> </w:t>
+      </w:r>
+      <w:r>
+        <w:t xml:space="preserve">to CANN. She fills in her professional details and ticks the consent box.</w:t>
+      </w:r>
+    </w:p>
+    <w:p>
+      <w:pPr>
+        <w:pStyle w:val="Compact"/>
+        <w:numPr>
+          <w:ilvl w:val="0"/>
+          <w:numId w:val="1004"/>
+        </w:numPr>
+      </w:pPr>
+      <w:r>
+        <w:t xml:space="preserve">She is saved instantly to the website database, then synced to Zoho within seconds.</w:t>
+      </w:r>
+    </w:p>
+    <w:p>
+      <w:pPr>
+        <w:pStyle w:val="Compact"/>
+        <w:numPr>
+          <w:ilvl w:val="0"/>
+          <w:numId w:val="1004"/>
+        </w:numPr>
+      </w:pPr>
+      <w:r>
+        <w:t xml:space="preserve">Because CANN membership automatically includes CAS membership, her CRM record shows</w:t>
+      </w:r>
+      <w:r>
+        <w:t xml:space="preserve"> </w:t>
+      </w:r>
+      <w:r>
+        <w:rPr>
+          <w:b/>
+          <w:bCs/>
+        </w:rPr>
+        <w:t xml:space="preserve">both</w:t>
+      </w:r>
+      <w:r>
+        <w:t xml:space="preserve"> </w:t>
+      </w:r>
+      <w:r>
+        <w:rPr>
+          <w:rStyle w:val="VerbatimChar"/>
+        </w:rPr>
+        <w:t xml:space="preserve">CANN_Member = true</w:t>
+      </w:r>
+      <w:r>
+        <w:t xml:space="preserve"> </w:t>
+      </w:r>
+      <w:r>
+        <w:t xml:space="preserve">and</w:t>
+      </w:r>
+      <w:r>
+        <w:t xml:space="preserve"> </w:t>
+      </w:r>
+      <w:r>
+        <w:rPr>
+          <w:rStyle w:val="VerbatimChar"/>
+        </w:rPr>
+        <w:t xml:space="preserve">CAS_Member = true</w:t>
+      </w:r>
+      <w:r>
+        <w:t xml:space="preserve">.</w:t>
+      </w:r>
+    </w:p>
+    <w:p>
+      <w:pPr>
+        <w:pStyle w:val="Compact"/>
+        <w:numPr>
+          <w:ilvl w:val="0"/>
+          <w:numId w:val="1004"/>
+        </w:numPr>
+      </w:pPr>
+      <w:r>
+        <w:t xml:space="preserve">Her record is classified as</w:t>
+      </w:r>
+      <w:r>
+        <w:t xml:space="preserve"> </w:t>
+      </w:r>
+      <w:r>
+        <w:rPr>
+          <w:b/>
+          <w:bCs/>
+        </w:rPr>
+        <w:t xml:space="preserve">“</w:t>
+      </w:r>
+      <w:r>
+        <w:rPr>
+          <w:b/>
+          <w:bCs/>
+        </w:rPr>
+        <w:t xml:space="preserve">Member</w:t>
+      </w:r>
+      <w:r>
+        <w:rPr>
+          <w:b/>
+          <w:bCs/>
+        </w:rPr>
+        <w:t xml:space="preserve">”</w:t>
+      </w:r>
+      <w:r>
+        <w:t xml:space="preserve">, sourced as</w:t>
+      </w:r>
+      <w:r>
+        <w:t xml:space="preserve"> </w:t>
+      </w:r>
+      <w:r>
+        <w:rPr>
+          <w:b/>
+          <w:bCs/>
+        </w:rPr>
+        <w:t xml:space="preserve">“</w:t>
+      </w:r>
+      <w:r>
+        <w:rPr>
+          <w:b/>
+          <w:bCs/>
+        </w:rPr>
+        <w:t xml:space="preserve">Website - CAS &amp; CANN Registration</w:t>
+      </w:r>
+      <w:r>
+        <w:rPr>
+          <w:b/>
+          <w:bCs/>
+        </w:rPr>
+        <w:t xml:space="preserve">”</w:t>
+      </w:r>
+      <w:r>
+        <w:t xml:space="preserve">, and both communication consents are recorded as</w:t>
+      </w:r>
+      <w:r>
+        <w:t xml:space="preserve"> </w:t>
+      </w:r>
+      <w:r>
+        <w:rPr>
+          <w:b/>
+          <w:bCs/>
+        </w:rPr>
+        <w:t xml:space="preserve">“</w:t>
+      </w:r>
+      <w:r>
+        <w:rPr>
+          <w:b/>
+          <w:bCs/>
+        </w:rPr>
+        <w:t xml:space="preserve">Yes</w:t>
+      </w:r>
+      <w:r>
+        <w:rPr>
+          <w:b/>
+          <w:bCs/>
+        </w:rPr>
+        <w:t xml:space="preserve">”</w:t>
+      </w:r>
+      <w:r>
+        <w:t xml:space="preserve">.</w:t>
+      </w:r>
+    </w:p>
+    <w:p>
+      <w:pPr>
+        <w:pStyle w:val="FirstParagraph"/>
+      </w:pPr>
+      <w:r>
+        <w:rPr>
+          <w:b/>
+          <w:bCs/>
+        </w:rPr>
+        <w:t xml:space="preserve">Example 2 — A physician joins CAS and opts into the Services Map</w:t>
+      </w:r>
+    </w:p>
+    <w:p>
+      <w:pPr>
+        <w:pStyle w:val="BodyText"/>
+      </w:pPr>
+      <w:r>
+        <w:t xml:space="preserve">Dr. Chen, a hematologist in Vancouver, answers</w:t>
+      </w:r>
+      <w:r>
+        <w:t xml:space="preserve"> </w:t>
+      </w:r>
+      <w:r>
+        <w:rPr>
+          <w:i/>
+          <w:iCs/>
+        </w:rPr>
+        <w:t xml:space="preserve">Yes</w:t>
+      </w:r>
+      <w:r>
+        <w:t xml:space="preserve"> </w:t>
+      </w:r>
+      <w:r>
+        <w:t xml:space="preserve">to CAS,</w:t>
+      </w:r>
+      <w:r>
+        <w:t xml:space="preserve"> </w:t>
+      </w:r>
+      <w:r>
+        <w:rPr>
+          <w:i/>
+          <w:iCs/>
+        </w:rPr>
+        <w:t xml:space="preserve">No</w:t>
+      </w:r>
+      <w:r>
+        <w:t xml:space="preserve"> </w:t>
+      </w:r>
+      <w:r>
+        <w:t xml:space="preserve">to CANN, and opts to have his clinic listed on the Amyloidosis Services Map.</w:t>
+      </w:r>
+    </w:p>
+    <w:p>
+      <w:pPr>
+        <w:pStyle w:val="Compact"/>
+        <w:numPr>
+          <w:ilvl w:val="0"/>
+          <w:numId w:val="1005"/>
+        </w:numPr>
+      </w:pPr>
+      <w:r>
+        <w:t xml:space="preserve">His CRM record shows</w:t>
+      </w:r>
+      <w:r>
+        <w:t xml:space="preserve"> </w:t>
+      </w:r>
+      <w:r>
+        <w:rPr>
+          <w:rStyle w:val="VerbatimChar"/>
+        </w:rPr>
+        <w:t xml:space="preserve">CAS_Member = true</w:t>
+      </w:r>
+      <w:r>
+        <w:t xml:space="preserve">,</w:t>
+      </w:r>
+      <w:r>
+        <w:t xml:space="preserve"> </w:t>
+      </w:r>
+      <w:r>
+        <w:rPr>
+          <w:rStyle w:val="VerbatimChar"/>
+        </w:rPr>
+        <w:t xml:space="preserve">CANN_Member = false</w:t>
+      </w:r>
+      <w:r>
+        <w:t xml:space="preserve">, classified as</w:t>
+      </w:r>
+      <w:r>
+        <w:t xml:space="preserve"> </w:t>
+      </w:r>
+      <w:r>
+        <w:rPr>
+          <w:b/>
+          <w:bCs/>
+        </w:rPr>
+        <w:t xml:space="preserve">“</w:t>
+      </w:r>
+      <w:r>
+        <w:rPr>
+          <w:b/>
+          <w:bCs/>
+        </w:rPr>
+        <w:t xml:space="preserve">Member</w:t>
+      </w:r>
+      <w:r>
+        <w:rPr>
+          <w:b/>
+          <w:bCs/>
+        </w:rPr>
+        <w:t xml:space="preserve">”</w:t>
+      </w:r>
+      <w:r>
+        <w:t xml:space="preserve">, sourced as</w:t>
+      </w:r>
+      <w:r>
+        <w:t xml:space="preserve"> </w:t>
+      </w:r>
+      <w:r>
+        <w:rPr>
+          <w:b/>
+          <w:bCs/>
+        </w:rPr>
+        <w:t xml:space="preserve">“</w:t>
+      </w:r>
+      <w:r>
+        <w:rPr>
+          <w:b/>
+          <w:bCs/>
+        </w:rPr>
+        <w:t xml:space="preserve">Website - CAS Registration</w:t>
+      </w:r>
+      <w:r>
+        <w:rPr>
+          <w:b/>
+          <w:bCs/>
+        </w:rPr>
+        <w:t xml:space="preserve">”</w:t>
+      </w:r>
+      <w:r>
+        <w:t xml:space="preserve">.</w:t>
+      </w:r>
+    </w:p>
+    <w:p>
+      <w:pPr>
+        <w:pStyle w:val="Compact"/>
+        <w:numPr>
+          <w:ilvl w:val="0"/>
+          <w:numId w:val="1005"/>
+        </w:numPr>
+      </w:pPr>
+      <w:r>
+        <w:t xml:space="preserve">His clinic name, street, city, province, and postal code are stored in the dedicated Map fields, ready for the Services Map.</w:t>
+      </w:r>
+    </w:p>
+    <w:p>
+      <w:pPr>
+        <w:pStyle w:val="FirstParagraph"/>
+      </w:pPr>
+      <w:r>
+        <w:rPr>
+          <w:b/>
+          <w:bCs/>
+        </w:rPr>
+        <w:t xml:space="preserve">Example 3 — A visitor sends an inquiry without joining</w:t>
+      </w:r>
+    </w:p>
+    <w:p>
+      <w:pPr>
+        <w:pStyle w:val="BodyText"/>
+      </w:pPr>
+      <w:r>
+        <w:t xml:space="preserve">A caregiver answers</w:t>
+      </w:r>
+      <w:r>
+        <w:t xml:space="preserve"> </w:t>
+      </w:r>
+      <w:r>
+        <w:rPr>
+          <w:i/>
+          <w:iCs/>
+        </w:rPr>
+        <w:t xml:space="preserve">No</w:t>
+      </w:r>
+      <w:r>
+        <w:t xml:space="preserve"> </w:t>
+      </w:r>
+      <w:r>
+        <w:t xml:space="preserve">to both membership questions and writes a message asking about support resources.</w:t>
+      </w:r>
+    </w:p>
+    <w:p>
+      <w:pPr>
+        <w:pStyle w:val="Compact"/>
+        <w:numPr>
+          <w:ilvl w:val="0"/>
+          <w:numId w:val="1006"/>
+        </w:numPr>
+      </w:pPr>
+      <w:r>
+        <w:t xml:space="preserve">Only name, email, and message are collected.</w:t>
+      </w:r>
+    </w:p>
+    <w:p>
+      <w:pPr>
+        <w:pStyle w:val="Compact"/>
+        <w:numPr>
+          <w:ilvl w:val="0"/>
+          <w:numId w:val="1006"/>
+        </w:numPr>
+      </w:pPr>
+      <w:r>
+        <w:t xml:space="preserve">The CRM record is classified as</w:t>
+      </w:r>
+      <w:r>
+        <w:t xml:space="preserve"> </w:t>
+      </w:r>
+      <w:r>
+        <w:rPr>
+          <w:b/>
+          <w:bCs/>
+        </w:rPr>
+        <w:t xml:space="preserve">“</w:t>
+      </w:r>
+      <w:r>
+        <w:rPr>
+          <w:b/>
+          <w:bCs/>
+        </w:rPr>
+        <w:t xml:space="preserve">Inquiry</w:t>
+      </w:r>
+      <w:r>
+        <w:rPr>
+          <w:b/>
+          <w:bCs/>
+        </w:rPr>
+        <w:t xml:space="preserve">”</w:t>
+      </w:r>
+      <w:r>
+        <w:t xml:space="preserve"> </w:t>
+      </w:r>
+      <w:r>
+        <w:t xml:space="preserve">with source</w:t>
+      </w:r>
+      <w:r>
+        <w:t xml:space="preserve"> </w:t>
+      </w:r>
+      <w:r>
+        <w:rPr>
+          <w:b/>
+          <w:bCs/>
+        </w:rPr>
+        <w:t xml:space="preserve">“</w:t>
+      </w:r>
+      <w:r>
+        <w:rPr>
+          <w:b/>
+          <w:bCs/>
+        </w:rPr>
+        <w:t xml:space="preserve">Website - Contact Inquiry</w:t>
+      </w:r>
+      <w:r>
+        <w:rPr>
+          <w:b/>
+          <w:bCs/>
+        </w:rPr>
+        <w:t xml:space="preserve">”</w:t>
+      </w:r>
+      <w:r>
+        <w:t xml:space="preserve"> </w:t>
+      </w:r>
+      <w:r>
+        <w:t xml:space="preserve">— so inquiry contacts can be excluded from member-only email campaigns.</w:t>
+      </w:r>
+    </w:p>
+    <w:p>
+      <w:pPr>
+        <w:pStyle w:val="FirstParagraph"/>
+      </w:pPr>
+      <w:r>
+        <w:rPr>
+          <w:b/>
+          <w:bCs/>
+        </w:rPr>
+        <w:t xml:space="preserve">Example 4 — An existing member submits the form again</w:t>
+      </w:r>
+    </w:p>
+    <w:p>
+      <w:pPr>
+        <w:pStyle w:val="BodyText"/>
+      </w:pPr>
+      <w:r>
+        <w:t xml:space="preserve">Dr. Chen (from Example 2) later re-submits the form to join CANN, but forgets to tick the CAS box.</w:t>
+      </w:r>
+    </w:p>
+    <w:p>
+      <w:pPr>
+        <w:pStyle w:val="Compact"/>
+        <w:numPr>
+          <w:ilvl w:val="0"/>
+          <w:numId w:val="1007"/>
+        </w:numPr>
+      </w:pPr>
+      <w:r>
+        <w:t xml:space="preserve">The system finds his existing CRM record by email and</w:t>
+      </w:r>
+      <w:r>
+        <w:t xml:space="preserve"> </w:t>
+      </w:r>
+      <w:r>
+        <w:rPr>
+          <w:b/>
+          <w:bCs/>
+        </w:rPr>
+        <w:t xml:space="preserve">updates</w:t>
+      </w:r>
+      <w:r>
+        <w:t xml:space="preserve"> </w:t>
+      </w:r>
+      <w:r>
+        <w:t xml:space="preserve">it rather than creating a duplicate.</w:t>
+      </w:r>
+    </w:p>
+    <w:p>
+      <w:pPr>
+        <w:pStyle w:val="Compact"/>
+        <w:numPr>
+          <w:ilvl w:val="0"/>
+          <w:numId w:val="1007"/>
+        </w:numPr>
+      </w:pPr>
+      <w:r>
+        <w:t xml:space="preserve">His</w:t>
+      </w:r>
+      <w:r>
+        <w:t xml:space="preserve"> </w:t>
+      </w:r>
+      <w:r>
+        <w:rPr>
+          <w:rStyle w:val="VerbatimChar"/>
+        </w:rPr>
+        <w:t xml:space="preserve">CANN_Member</w:t>
+      </w:r>
+      <w:r>
+        <w:t xml:space="preserve"> </w:t>
+      </w:r>
+      <w:r>
+        <w:t xml:space="preserve">flag is upgraded to</w:t>
+      </w:r>
+      <w:r>
+        <w:t xml:space="preserve"> </w:t>
+      </w:r>
+      <w:r>
+        <w:rPr>
+          <w:rStyle w:val="VerbatimChar"/>
+        </w:rPr>
+        <w:t xml:space="preserve">true</w:t>
+      </w:r>
+      <w:r>
+        <w:t xml:space="preserve">; his existing</w:t>
+      </w:r>
+      <w:r>
+        <w:t xml:space="preserve"> </w:t>
+      </w:r>
+      <w:r>
+        <w:rPr>
+          <w:rStyle w:val="VerbatimChar"/>
+        </w:rPr>
+        <w:t xml:space="preserve">CAS_Member = true</w:t>
+      </w:r>
+      <w:r>
+        <w:t xml:space="preserve"> </w:t>
+      </w:r>
+      <w:r>
+        <w:t xml:space="preserve">is</w:t>
+      </w:r>
+      <w:r>
+        <w:t xml:space="preserve"> </w:t>
+      </w:r>
+      <w:r>
+        <w:rPr>
+          <w:b/>
+          <w:bCs/>
+        </w:rPr>
+        <w:t xml:space="preserve">kept</w:t>
+      </w:r>
+      <w:r>
+        <w:t xml:space="preserve"> </w:t>
+      </w:r>
+      <w:r>
+        <w:t xml:space="preserve">(membership is never downgraded by a re-submission).</w:t>
+      </w:r>
+    </w:p>
     <w:p>
       <w:r>
         <w:pict>
@@ -1040,9 +1648,9 @@
         </w:pict>
       </w:r>
     </w:p>
-    <w:bookmarkEnd w:id="24"/>
     <w:bookmarkEnd w:id="25"/>
-    <w:bookmarkStart w:id="34" w:name="part-2-technical-reference"/>
+    <w:bookmarkEnd w:id="26"/>
+    <w:bookmarkStart w:id="38" w:name="part-2-technical-reference"/>
     <w:p>
       <w:pPr>
         <w:pStyle w:val="Heading1"/>
@@ -1051,7 +1659,7 @@
         <w:t xml:space="preserve">Part 2: Technical Reference</w:t>
       </w:r>
     </w:p>
-    <w:bookmarkStart w:id="26" w:name="architecture-at-a-glance"/>
+    <w:bookmarkStart w:id="27" w:name="architecture-at-a-glance"/>
     <w:p>
       <w:pPr>
         <w:pStyle w:val="Heading2"/>
@@ -1152,8 +1760,8 @@
         <w:t xml:space="preserve">                  Zoho CRM — Leads module         (search-by-email upsert)</w:t>
       </w:r>
     </w:p>
-    <w:bookmarkEnd w:id="26"/>
-    <w:bookmarkStart w:id="27" w:name="form-fields-client-side"/>
+    <w:bookmarkEnd w:id="27"/>
+    <w:bookmarkStart w:id="28" w:name="form-fields-client-side"/>
     <w:p>
       <w:pPr>
         <w:pStyle w:val="Heading2"/>
@@ -2484,8 +3092,8 @@
         </w:tc>
       </w:tr>
     </w:tbl>
-    <w:bookmarkEnd w:id="27"/>
-    <w:bookmarkStart w:id="28" w:name="local-database-storage"/>
+    <w:bookmarkEnd w:id="28"/>
+    <w:bookmarkStart w:id="29" w:name="local-database-storage"/>
     <w:p>
       <w:pPr>
         <w:pStyle w:val="Heading2"/>
@@ -2969,8 +3577,8 @@
         </w:tc>
       </w:tr>
     </w:tbl>
-    <w:bookmarkEnd w:id="28"/>
-    <w:bookmarkStart w:id="30" w:name="field-by-field-mapping-to-zoho-crm"/>
+    <w:bookmarkEnd w:id="29"/>
+    <w:bookmarkStart w:id="31" w:name="field-by-field-mapping-to-zoho-crm"/>
     <w:p>
       <w:pPr>
         <w:pStyle w:val="Heading2"/>
@@ -4181,7 +4789,7 @@
         </w:tc>
       </w:tr>
     </w:tbl>
-    <w:bookmarkStart w:id="29" w:name="business-rules-enforced-centrally"/>
+    <w:bookmarkStart w:id="30" w:name="business-rules-enforced-centrally"/>
     <w:p>
       <w:pPr>
         <w:pStyle w:val="Heading3"/>
@@ -4195,7 +4803,7 @@
         <w:pStyle w:val="Compact"/>
         <w:numPr>
           <w:ilvl w:val="0"/>
-          <w:numId w:val="1004"/>
+          <w:numId w:val="1008"/>
         </w:numPr>
       </w:pPr>
       <w:r>
@@ -4241,7 +4849,7 @@
         <w:pStyle w:val="Compact"/>
         <w:numPr>
           <w:ilvl w:val="0"/>
-          <w:numId w:val="1004"/>
+          <w:numId w:val="1008"/>
         </w:numPr>
       </w:pPr>
       <w:r>
@@ -4296,7 +4904,7 @@
         <w:pStyle w:val="Compact"/>
         <w:numPr>
           <w:ilvl w:val="0"/>
-          <w:numId w:val="1004"/>
+          <w:numId w:val="1008"/>
         </w:numPr>
       </w:pPr>
       <w:r>
@@ -4315,524 +4923,70 @@
         <w:pStyle w:val="Compact"/>
         <w:numPr>
           <w:ilvl w:val="0"/>
-          <w:numId w:val="1004"/>
-        </w:numPr>
-      </w:pPr>
-      <w:r>
-        <w:rPr>
-          <w:b/>
-          <w:bCs/>
-        </w:rPr>
-        <w:t xml:space="preserve">Consent values</w:t>
-      </w:r>
-      <w:r>
-        <w:t xml:space="preserve">: normalized to the exact picklist strings Zoho expects (</w:t>
-      </w:r>
-      <w:r>
-        <w:t xml:space="preserve">“</w:t>
-      </w:r>
-      <w:r>
-        <w:t xml:space="preserve">Yes</w:t>
-      </w:r>
-      <w:r>
-        <w:t xml:space="preserve">”</w:t>
-      </w:r>
-      <w:r>
-        <w:t xml:space="preserve">/</w:t>
-      </w:r>
-      <w:r>
-        <w:t xml:space="preserve">“</w:t>
-      </w:r>
-      <w:r>
-        <w:t xml:space="preserve">No</w:t>
-      </w:r>
-      <w:r>
-        <w:t xml:space="preserve">”</w:t>
-      </w:r>
-      <w:r>
-        <w:t xml:space="preserve">).</w:t>
-      </w:r>
-    </w:p>
-    <w:bookmarkEnd w:id="29"/>
-    <w:bookmarkEnd w:id="30"/>
-    <w:bookmarkStart w:id="31" w:name="sync-process-and-reliability"/>
-    <w:p>
-      <w:pPr>
-        <w:pStyle w:val="Heading2"/>
-      </w:pPr>
-      <w:r>
-        <w:t xml:space="preserve">2.4 Sync process and reliability</w:t>
-      </w:r>
-    </w:p>
-    <w:p>
-      <w:pPr>
-        <w:pStyle w:val="FirstParagraph"/>
-      </w:pPr>
-      <w:r>
-        <w:t xml:space="preserve">Component: background sync worker (</w:t>
-      </w:r>
-      <w:r>
-        <w:rPr>
-          <w:rStyle w:val="VerbatimChar"/>
-        </w:rPr>
-        <w:t xml:space="preserve">server/zoho-sync-worker.ts</w:t>
-      </w:r>
-      <w:r>
-        <w:t xml:space="preserve">).</w:t>
-      </w:r>
-    </w:p>
-    <w:p>
-      <w:pPr>
-        <w:pStyle w:val="Compact"/>
-        <w:numPr>
-          <w:ilvl w:val="0"/>
-          <w:numId w:val="1005"/>
-        </w:numPr>
-      </w:pPr>
-      <w:r>
-        <w:rPr>
-          <w:b/>
-          <w:bCs/>
-        </w:rPr>
-        <w:t xml:space="preserve">Local-first</w:t>
-      </w:r>
-      <w:r>
-        <w:t xml:space="preserve">: the API route writes to</w:t>
-      </w:r>
-      <w:r>
-        <w:t xml:space="preserve"> </w:t>
-      </w:r>
-      <w:r>
-        <w:rPr>
-          <w:rStyle w:val="VerbatimChar"/>
-        </w:rPr>
-        <w:t xml:space="preserve">form_submissions</w:t>
-      </w:r>
-      <w:r>
-        <w:t xml:space="preserve"> </w:t>
-      </w:r>
-      <w:r>
-        <w:t xml:space="preserve">and returns success to the visitor immediately. The CRM sync is fully asynchronous — a Zoho outage never blocks or fails a form submission.</w:t>
-      </w:r>
-    </w:p>
-    <w:p>
-      <w:pPr>
-        <w:pStyle w:val="Compact"/>
-        <w:numPr>
-          <w:ilvl w:val="0"/>
-          <w:numId w:val="1005"/>
-        </w:numPr>
-      </w:pPr>
-      <w:r>
-        <w:rPr>
-          <w:b/>
-          <w:bCs/>
-        </w:rPr>
-        <w:t xml:space="preserve">Polling</w:t>
-      </w:r>
-      <w:r>
-        <w:t xml:space="preserve">: the worker checks for</w:t>
-      </w:r>
-      <w:r>
-        <w:t xml:space="preserve"> </w:t>
-      </w:r>
-      <w:r>
-        <w:rPr>
-          <w:rStyle w:val="VerbatimChar"/>
-        </w:rPr>
-        <w:t xml:space="preserve">pending</w:t>
-      </w:r>
-      <w:r>
-        <w:t xml:space="preserve"> </w:t>
-      </w:r>
-      <w:r>
-        <w:t xml:space="preserve">submissions every</w:t>
-      </w:r>
-      <w:r>
-        <w:t xml:space="preserve"> </w:t>
-      </w:r>
-      <w:r>
-        <w:rPr>
-          <w:b/>
-          <w:bCs/>
-        </w:rPr>
-        <w:t xml:space="preserve">10 seconds</w:t>
-      </w:r>
-      <w:r>
-        <w:t xml:space="preserve">.</w:t>
-      </w:r>
-    </w:p>
-    <w:p>
-      <w:pPr>
-        <w:pStyle w:val="Compact"/>
-        <w:numPr>
-          <w:ilvl w:val="0"/>
-          <w:numId w:val="1005"/>
-        </w:numPr>
-      </w:pPr>
-      <w:r>
-        <w:rPr>
-          <w:b/>
-          <w:bCs/>
-        </w:rPr>
-        <w:t xml:space="preserve">Retry strategy (two-phase)</w:t>
-      </w:r>
-      <w:r>
-        <w:t xml:space="preserve">:</w:t>
-      </w:r>
-    </w:p>
-    <w:p>
-      <w:pPr>
-        <w:pStyle w:val="Compact"/>
-        <w:numPr>
-          <w:ilvl w:val="1"/>
-          <w:numId w:val="1006"/>
-        </w:numPr>
-      </w:pPr>
-      <w:r>
-        <w:rPr>
-          <w:i/>
-          <w:iCs/>
-        </w:rPr>
-        <w:t xml:space="preserve">Fast phase</w:t>
-      </w:r>
-      <w:r>
-        <w:t xml:space="preserve">: first 5 attempts with exponential backoff — 10 s, 20 s, 40 s, 80 s, 160 s.</w:t>
-      </w:r>
-    </w:p>
-    <w:p>
-      <w:pPr>
-        <w:pStyle w:val="Compact"/>
-        <w:numPr>
-          <w:ilvl w:val="1"/>
-          <w:numId w:val="1006"/>
-        </w:numPr>
-      </w:pPr>
-      <w:r>
-        <w:rPr>
-          <w:i/>
-          <w:iCs/>
-        </w:rPr>
-        <w:t xml:space="preserve">Slow phase</w:t>
-      </w:r>
-      <w:r>
-        <w:t xml:space="preserve">: attempts 6–50 at</w:t>
-      </w:r>
-      <w:r>
-        <w:t xml:space="preserve"> </w:t>
-      </w:r>
-      <w:r>
-        <w:rPr>
-          <w:b/>
-          <w:bCs/>
-        </w:rPr>
-        <w:t xml:space="preserve">5-minute</w:t>
-      </w:r>
-      <w:r>
-        <w:t xml:space="preserve"> </w:t>
-      </w:r>
-      <w:r>
-        <w:t xml:space="preserve">intervals.</w:t>
-      </w:r>
-    </w:p>
-    <w:p>
-      <w:pPr>
-        <w:pStyle w:val="Compact"/>
-        <w:numPr>
-          <w:ilvl w:val="1"/>
-          <w:numId w:val="1006"/>
-        </w:numPr>
-      </w:pPr>
-      <w:r>
-        <w:t xml:space="preserve">A separate re-queue job runs every 5 minutes to rescue submissions stuck in a failed state for 30+ minutes, with progressive backoff capping at 60-minute intervals.</w:t>
-      </w:r>
-    </w:p>
-    <w:p>
-      <w:pPr>
-        <w:pStyle w:val="Compact"/>
-        <w:numPr>
-          <w:ilvl w:val="1"/>
-          <w:numId w:val="1006"/>
-        </w:numPr>
-      </w:pPr>
-      <w:r>
-        <w:rPr>
-          <w:b/>
-          <w:bCs/>
-        </w:rPr>
-        <w:t xml:space="preserve">Cap</w:t>
-      </w:r>
-      <w:r>
-        <w:t xml:space="preserve">: 50 total attempts (≈ 4 days). After that,</w:t>
-      </w:r>
-      <w:r>
-        <w:t xml:space="preserve"> </w:t>
-      </w:r>
-      <w:r>
-        <w:rPr>
-          <w:rStyle w:val="VerbatimChar"/>
-        </w:rPr>
-        <w:t xml:space="preserve">processingStatus</w:t>
-      </w:r>
-      <w:r>
-        <w:t xml:space="preserve"> </w:t>
-      </w:r>
-      <w:r>
-        <w:t xml:space="preserve">is set to</w:t>
-      </w:r>
-      <w:r>
-        <w:t xml:space="preserve"> </w:t>
-      </w:r>
-      <w:r>
-        <w:rPr>
-          <w:rStyle w:val="VerbatimChar"/>
-        </w:rPr>
-        <w:t xml:space="preserve">failed</w:t>
-      </w:r>
-      <w:r>
-        <w:t xml:space="preserve"> </w:t>
-      </w:r>
-      <w:r>
-        <w:t xml:space="preserve">and the record is surfaced for</w:t>
-      </w:r>
-      <w:r>
-        <w:t xml:space="preserve"> </w:t>
-      </w:r>
-      <w:r>
-        <w:rPr>
-          <w:b/>
-          <w:bCs/>
-        </w:rPr>
-        <w:t xml:space="preserve">manual review</w:t>
-      </w:r>
-      <w:r>
-        <w:t xml:space="preserve"> </w:t>
-      </w:r>
-      <w:r>
-        <w:t xml:space="preserve">— it remains safely stored in PostgreSQL.</w:t>
-      </w:r>
-    </w:p>
-    <w:p>
-      <w:pPr>
-        <w:pStyle w:val="Compact"/>
-        <w:numPr>
-          <w:ilvl w:val="0"/>
-          <w:numId w:val="1005"/>
-        </w:numPr>
-      </w:pPr>
-      <w:r>
-        <w:rPr>
-          <w:b/>
-          <w:bCs/>
-        </w:rPr>
-        <w:t xml:space="preserve">OAuth token management</w:t>
-      </w:r>
-      <w:r>
-        <w:t xml:space="preserve">: a dedicated token manager validates the Zoho access token before each request and automatically refreshes it (Zoho v8 API, Self Client credentials) on expiry — no manual re-authentication needed.</w:t>
-      </w:r>
-    </w:p>
-    <w:bookmarkEnd w:id="31"/>
-    <w:bookmarkStart w:id="32" w:name="deduplication-upsert-behaviour"/>
-    <w:p>
-      <w:pPr>
-        <w:pStyle w:val="Heading2"/>
-      </w:pPr>
-      <w:r>
-        <w:t xml:space="preserve">2.5 Deduplication / upsert behaviour</w:t>
-      </w:r>
-    </w:p>
-    <w:p>
-      <w:pPr>
-        <w:pStyle w:val="FirstParagraph"/>
-      </w:pPr>
-      <w:r>
-        <w:t xml:space="preserve">Before creating a Lead, the worker</w:t>
-      </w:r>
-      <w:r>
-        <w:t xml:space="preserve"> </w:t>
-      </w:r>
-      <w:r>
-        <w:rPr>
-          <w:b/>
-          <w:bCs/>
-        </w:rPr>
-        <w:t xml:space="preserve">searches Zoho by</w:t>
-      </w:r>
-      <w:r>
-        <w:rPr>
-          <w:b/>
-          <w:bCs/>
-        </w:rPr>
-        <w:t xml:space="preserve"> </w:t>
-      </w:r>
-      <w:r>
-        <w:rPr>
-          <w:rStyle w:val="VerbatimChar"/>
-          <w:b/>
-          <w:bCs/>
-        </w:rPr>
-        <w:t xml:space="preserve">Email</w:t>
-      </w:r>
-      <w:r>
-        <w:t xml:space="preserve">:</w:t>
-      </w:r>
-    </w:p>
-    <w:p>
-      <w:pPr>
-        <w:pStyle w:val="Compact"/>
-        <w:numPr>
-          <w:ilvl w:val="0"/>
-          <w:numId w:val="1007"/>
-        </w:numPr>
-      </w:pPr>
-      <w:r>
-        <w:rPr>
-          <w:b/>
-          <w:bCs/>
-        </w:rPr>
-        <w:t xml:space="preserve">No match</w:t>
-      </w:r>
-      <w:r>
-        <w:t xml:space="preserve"> </w:t>
-      </w:r>
-      <w:r>
-        <w:t xml:space="preserve">→ a new Lead is created.</w:t>
-      </w:r>
-    </w:p>
-    <w:p>
-      <w:pPr>
-        <w:pStyle w:val="Compact"/>
-        <w:numPr>
-          <w:ilvl w:val="0"/>
-          <w:numId w:val="1007"/>
-        </w:numPr>
-      </w:pPr>
-      <w:r>
-        <w:rPr>
-          <w:b/>
-          <w:bCs/>
-        </w:rPr>
-        <w:t xml:space="preserve">Match found</w:t>
-      </w:r>
-      <w:r>
-        <w:t xml:space="preserve"> </w:t>
-      </w:r>
-      <w:r>
-        <w:t xml:space="preserve">→ the existing Lead is</w:t>
-      </w:r>
-      <w:r>
-        <w:t xml:space="preserve"> </w:t>
-      </w:r>
-      <w:r>
-        <w:rPr>
-          <w:b/>
-          <w:bCs/>
-        </w:rPr>
-        <w:t xml:space="preserve">updated</w:t>
-      </w:r>
-      <w:r>
-        <w:t xml:space="preserve"> </w:t>
-      </w:r>
-      <w:r>
-        <w:t xml:space="preserve">(upsert). Merge rules:</w:t>
-      </w:r>
-    </w:p>
-    <w:p>
-      <w:pPr>
-        <w:pStyle w:val="Compact"/>
-        <w:numPr>
-          <w:ilvl w:val="1"/>
           <w:numId w:val="1008"/>
         </w:numPr>
       </w:pPr>
       <w:r>
-        <w:t xml:space="preserve">Text fields: the latest submission wins.</w:t>
-      </w:r>
-    </w:p>
-    <w:p>
-      <w:pPr>
-        <w:pStyle w:val="Compact"/>
-        <w:numPr>
-          <w:ilvl w:val="1"/>
-          <w:numId w:val="1008"/>
-        </w:numPr>
-      </w:pPr>
-      <w:r>
-        <w:t xml:space="preserve">Membership flags (</w:t>
+        <w:rPr>
+          <w:b/>
+          <w:bCs/>
+        </w:rPr>
+        <w:t xml:space="preserve">Consent values</w:t>
+      </w:r>
+      <w:r>
+        <w:t xml:space="preserve">: normalized to the exact picklist strings Zoho expects (</w:t>
+      </w:r>
+      <w:r>
+        <w:t xml:space="preserve">“</w:t>
+      </w:r>
+      <w:r>
+        <w:t xml:space="preserve">Yes</w:t>
+      </w:r>
+      <w:r>
+        <w:t xml:space="preserve">”</w:t>
+      </w:r>
+      <w:r>
+        <w:t xml:space="preserve">/</w:t>
+      </w:r>
+      <w:r>
+        <w:t xml:space="preserve">“</w:t>
+      </w:r>
+      <w:r>
+        <w:t xml:space="preserve">No</w:t>
+      </w:r>
+      <w:r>
+        <w:t xml:space="preserve">”</w:t>
+      </w:r>
+      <w:r>
+        <w:t xml:space="preserve">).</w:t>
+      </w:r>
+    </w:p>
+    <w:bookmarkEnd w:id="30"/>
+    <w:bookmarkEnd w:id="31"/>
+    <w:bookmarkStart w:id="32" w:name="sync-process-and-reliability"/>
+    <w:p>
+      <w:pPr>
+        <w:pStyle w:val="Heading2"/>
+      </w:pPr>
+      <w:r>
+        <w:t xml:space="preserve">2.4 Sync process and reliability</w:t>
+      </w:r>
+    </w:p>
+    <w:p>
+      <w:pPr>
+        <w:pStyle w:val="FirstParagraph"/>
+      </w:pPr>
+      <w:r>
+        <w:t xml:space="preserve">Component: background sync worker (</w:t>
       </w:r>
       <w:r>
         <w:rPr>
           <w:rStyle w:val="VerbatimChar"/>
         </w:rPr>
-        <w:t xml:space="preserve">CAS_Member</w:t>
-      </w:r>
-      <w:r>
-        <w:t xml:space="preserve">,</w:t>
-      </w:r>
-      <w:r>
-        <w:t xml:space="preserve"> </w:t>
-      </w:r>
-      <w:r>
-        <w:rPr>
-          <w:rStyle w:val="VerbatimChar"/>
-        </w:rPr>
-        <w:t xml:space="preserve">CANN_Member</w:t>
-      </w:r>
-      <w:r>
-        <w:t xml:space="preserve">):</w:t>
-      </w:r>
-      <w:r>
-        <w:t xml:space="preserve"> </w:t>
-      </w:r>
-      <w:r>
-        <w:rPr>
-          <w:b/>
-          <w:bCs/>
-        </w:rPr>
-        <w:t xml:space="preserve">upgrade-only</w:t>
-      </w:r>
-      <w:r>
-        <w:t xml:space="preserve"> </w:t>
-      </w:r>
-      <w:r>
-        <w:t xml:space="preserve">— once</w:t>
-      </w:r>
-      <w:r>
-        <w:t xml:space="preserve"> </w:t>
-      </w:r>
-      <w:r>
-        <w:rPr>
-          <w:rStyle w:val="VerbatimChar"/>
-        </w:rPr>
-        <w:t xml:space="preserve">true</w:t>
-      </w:r>
-      <w:r>
-        <w:t xml:space="preserve">, they are never reverted to</w:t>
-      </w:r>
-      <w:r>
-        <w:t xml:space="preserve"> </w:t>
-      </w:r>
-      <w:r>
-        <w:rPr>
-          <w:rStyle w:val="VerbatimChar"/>
-        </w:rPr>
-        <w:t xml:space="preserve">false</w:t>
-      </w:r>
-      <w:r>
-        <w:t xml:space="preserve"> </w:t>
-      </w:r>
-      <w:r>
-        <w:t xml:space="preserve">by a later submission.</w:t>
-      </w:r>
-    </w:p>
-    <w:bookmarkEnd w:id="32"/>
-    <w:bookmarkStart w:id="33" w:name="data-protection-notes"/>
-    <w:p>
-      <w:pPr>
-        <w:pStyle w:val="Heading2"/>
-      </w:pPr>
-      <w:r>
-        <w:t xml:space="preserve">2.6 Data protection notes</w:t>
+        <w:t xml:space="preserve">server/zoho-sync-worker.ts</w:t>
+      </w:r>
+      <w:r>
+        <w:t xml:space="preserve">).</w:t>
       </w:r>
     </w:p>
     <w:p>
@@ -4844,7 +4998,29 @@
         </w:numPr>
       </w:pPr>
       <w:r>
-        <w:t xml:space="preserve">Form input is validated server-side (Zod schemas) before storage.</w:t>
+        <w:rPr>
+          <w:b/>
+          <w:bCs/>
+        </w:rPr>
+        <w:t xml:space="preserve">Local-first</w:t>
+      </w:r>
+      <w:r>
+        <w:t xml:space="preserve">: the API route writes to</w:t>
+      </w:r>
+      <w:r>
+        <w:t xml:space="preserve"> </w:t>
+      </w:r>
+      <w:r>
+        <w:rPr>
+          <w:rStyle w:val="VerbatimChar"/>
+        </w:rPr>
+        <w:t xml:space="preserve">form_submissions</w:t>
+      </w:r>
+      <w:r>
+        <w:t xml:space="preserve"> </w:t>
+      </w:r>
+      <w:r>
+        <w:t xml:space="preserve">and returns success to the visitor immediately. The CRM sync is fully asynchronous — a Zoho outage never blocks or fails a form submission.</w:t>
       </w:r>
     </w:p>
     <w:p>
@@ -4856,7 +5032,42 @@
         </w:numPr>
       </w:pPr>
       <w:r>
-        <w:t xml:space="preserve">The Zoho connection uses OAuth 2.0; credentials are stored as server-side environment secrets, never in the codebase or browser.</w:t>
+        <w:rPr>
+          <w:b/>
+          <w:bCs/>
+        </w:rPr>
+        <w:t xml:space="preserve">Polling</w:t>
+      </w:r>
+      <w:r>
+        <w:t xml:space="preserve">: the worker checks for</w:t>
+      </w:r>
+      <w:r>
+        <w:t xml:space="preserve"> </w:t>
+      </w:r>
+      <w:r>
+        <w:rPr>
+          <w:rStyle w:val="VerbatimChar"/>
+        </w:rPr>
+        <w:t xml:space="preserve">pending</w:t>
+      </w:r>
+      <w:r>
+        <w:t xml:space="preserve"> </w:t>
+      </w:r>
+      <w:r>
+        <w:t xml:space="preserve">submissions every</w:t>
+      </w:r>
+      <w:r>
+        <w:t xml:space="preserve"> </w:t>
+      </w:r>
+      <w:r>
+        <w:rPr>
+          <w:b/>
+          <w:bCs/>
+        </w:rPr>
+        <w:t xml:space="preserve">10 seconds</w:t>
+      </w:r>
+      <w:r>
+        <w:t xml:space="preserve">.</w:t>
       </w:r>
     </w:p>
     <w:p>
@@ -4868,7 +5079,145 @@
         </w:numPr>
       </w:pPr>
       <w:r>
-        <w:t xml:space="preserve">The visitor-facing form communicates over HTTPS.</w:t>
+        <w:rPr>
+          <w:b/>
+          <w:bCs/>
+        </w:rPr>
+        <w:t xml:space="preserve">Retry strategy (two-phase)</w:t>
+      </w:r>
+      <w:r>
+        <w:t xml:space="preserve">:</w:t>
+      </w:r>
+    </w:p>
+    <w:p>
+      <w:pPr>
+        <w:pStyle w:val="Compact"/>
+        <w:numPr>
+          <w:ilvl w:val="1"/>
+          <w:numId w:val="1010"/>
+        </w:numPr>
+      </w:pPr>
+      <w:r>
+        <w:rPr>
+          <w:i/>
+          <w:iCs/>
+        </w:rPr>
+        <w:t xml:space="preserve">Fast phase</w:t>
+      </w:r>
+      <w:r>
+        <w:t xml:space="preserve">: first 5 attempts with exponential backoff — 10 s, 20 s, 40 s, 80 s, 160 s.</w:t>
+      </w:r>
+    </w:p>
+    <w:p>
+      <w:pPr>
+        <w:pStyle w:val="Compact"/>
+        <w:numPr>
+          <w:ilvl w:val="1"/>
+          <w:numId w:val="1010"/>
+        </w:numPr>
+      </w:pPr>
+      <w:r>
+        <w:rPr>
+          <w:i/>
+          <w:iCs/>
+        </w:rPr>
+        <w:t xml:space="preserve">Slow phase</w:t>
+      </w:r>
+      <w:r>
+        <w:t xml:space="preserve">: attempts 6–50 at</w:t>
+      </w:r>
+      <w:r>
+        <w:t xml:space="preserve"> </w:t>
+      </w:r>
+      <w:r>
+        <w:rPr>
+          <w:b/>
+          <w:bCs/>
+        </w:rPr>
+        <w:t xml:space="preserve">5-minute</w:t>
+      </w:r>
+      <w:r>
+        <w:t xml:space="preserve"> </w:t>
+      </w:r>
+      <w:r>
+        <w:t xml:space="preserve">intervals.</w:t>
+      </w:r>
+    </w:p>
+    <w:p>
+      <w:pPr>
+        <w:pStyle w:val="Compact"/>
+        <w:numPr>
+          <w:ilvl w:val="1"/>
+          <w:numId w:val="1010"/>
+        </w:numPr>
+      </w:pPr>
+      <w:r>
+        <w:t xml:space="preserve">A separate re-queue job runs every 5 minutes to rescue submissions stuck in a failed state for 30+ minutes, with progressive backoff capping at 60-minute intervals.</w:t>
+      </w:r>
+    </w:p>
+    <w:p>
+      <w:pPr>
+        <w:pStyle w:val="Compact"/>
+        <w:numPr>
+          <w:ilvl w:val="1"/>
+          <w:numId w:val="1010"/>
+        </w:numPr>
+      </w:pPr>
+      <w:r>
+        <w:rPr>
+          <w:b/>
+          <w:bCs/>
+        </w:rPr>
+        <w:t xml:space="preserve">Cap</w:t>
+      </w:r>
+      <w:r>
+        <w:t xml:space="preserve">: 50 total attempts (≈ 4 days). After that,</w:t>
+      </w:r>
+      <w:r>
+        <w:t xml:space="preserve"> </w:t>
+      </w:r>
+      <w:r>
+        <w:rPr>
+          <w:rStyle w:val="VerbatimChar"/>
+        </w:rPr>
+        <w:t xml:space="preserve">processingStatus</w:t>
+      </w:r>
+      <w:r>
+        <w:t xml:space="preserve"> </w:t>
+      </w:r>
+      <w:r>
+        <w:t xml:space="preserve">is set to</w:t>
+      </w:r>
+      <w:r>
+        <w:t xml:space="preserve"> </w:t>
+      </w:r>
+      <w:r>
+        <w:rPr>
+          <w:rStyle w:val="VerbatimChar"/>
+        </w:rPr>
+        <w:t xml:space="preserve">failed</w:t>
+      </w:r>
+      <w:r>
+        <w:t xml:space="preserve"> </w:t>
+      </w:r>
+      <w:r>
+        <w:t xml:space="preserve">and the record is surfaced for</w:t>
+      </w:r>
+      <w:r>
+        <w:t xml:space="preserve"> </w:t>
+      </w:r>
+      <w:r>
+        <w:rPr>
+          <w:b/>
+          <w:bCs/>
+        </w:rPr>
+        <w:t xml:space="preserve">manual review</w:t>
+      </w:r>
+      <w:r>
+        <w:t xml:space="preserve"> </w:t>
+      </w:r>
+      <w:r>
+        <w:t xml:space="preserve">— it remains safely stored in PostgreSQL.</w:t>
       </w:r>
     </w:p>
     <w:p>
@@ -4880,11 +5229,1836 @@
         </w:numPr>
       </w:pPr>
       <w:r>
-        <w:t xml:space="preserve">The local PostgreSQL copy provides an audit trail of every submission and its sync outcome.</w:t>
+        <w:rPr>
+          <w:b/>
+          <w:bCs/>
+        </w:rPr>
+        <w:t xml:space="preserve">OAuth token management</w:t>
+      </w:r>
+      <w:r>
+        <w:t xml:space="preserve">: a dedicated token manager validates the Zoho access token before each request and automatically refreshes it (Zoho v8 API, Self Client credentials) on expiry — no manual re-authentication needed.</w:t>
+      </w:r>
+    </w:p>
+    <w:bookmarkEnd w:id="32"/>
+    <w:bookmarkStart w:id="33" w:name="deduplication-upsert-behaviour"/>
+    <w:p>
+      <w:pPr>
+        <w:pStyle w:val="Heading2"/>
+      </w:pPr>
+      <w:r>
+        <w:t xml:space="preserve">2.5 Deduplication / upsert behaviour</w:t>
+      </w:r>
+    </w:p>
+    <w:p>
+      <w:pPr>
+        <w:pStyle w:val="FirstParagraph"/>
+      </w:pPr>
+      <w:r>
+        <w:t xml:space="preserve">Before creating a Lead, the worker</w:t>
+      </w:r>
+      <w:r>
+        <w:t xml:space="preserve"> </w:t>
+      </w:r>
+      <w:r>
+        <w:rPr>
+          <w:b/>
+          <w:bCs/>
+        </w:rPr>
+        <w:t xml:space="preserve">searches Zoho by</w:t>
+      </w:r>
+      <w:r>
+        <w:rPr>
+          <w:b/>
+          <w:bCs/>
+        </w:rPr>
+        <w:t xml:space="preserve"> </w:t>
+      </w:r>
+      <w:r>
+        <w:rPr>
+          <w:rStyle w:val="VerbatimChar"/>
+          <w:b/>
+          <w:bCs/>
+        </w:rPr>
+        <w:t xml:space="preserve">Email</w:t>
+      </w:r>
+      <w:r>
+        <w:t xml:space="preserve">:</w:t>
+      </w:r>
+    </w:p>
+    <w:p>
+      <w:pPr>
+        <w:pStyle w:val="Compact"/>
+        <w:numPr>
+          <w:ilvl w:val="0"/>
+          <w:numId w:val="1011"/>
+        </w:numPr>
+      </w:pPr>
+      <w:r>
+        <w:rPr>
+          <w:b/>
+          <w:bCs/>
+        </w:rPr>
+        <w:t xml:space="preserve">No match</w:t>
+      </w:r>
+      <w:r>
+        <w:t xml:space="preserve"> </w:t>
+      </w:r>
+      <w:r>
+        <w:t xml:space="preserve">→ a new Lead is created.</w:t>
+      </w:r>
+    </w:p>
+    <w:p>
+      <w:pPr>
+        <w:pStyle w:val="Compact"/>
+        <w:numPr>
+          <w:ilvl w:val="0"/>
+          <w:numId w:val="1011"/>
+        </w:numPr>
+      </w:pPr>
+      <w:r>
+        <w:rPr>
+          <w:b/>
+          <w:bCs/>
+        </w:rPr>
+        <w:t xml:space="preserve">Match found</w:t>
+      </w:r>
+      <w:r>
+        <w:t xml:space="preserve"> </w:t>
+      </w:r>
+      <w:r>
+        <w:t xml:space="preserve">→ the existing Lead is</w:t>
+      </w:r>
+      <w:r>
+        <w:t xml:space="preserve"> </w:t>
+      </w:r>
+      <w:r>
+        <w:rPr>
+          <w:b/>
+          <w:bCs/>
+        </w:rPr>
+        <w:t xml:space="preserve">updated</w:t>
+      </w:r>
+      <w:r>
+        <w:t xml:space="preserve"> </w:t>
+      </w:r>
+      <w:r>
+        <w:t xml:space="preserve">(upsert). Merge rules:</w:t>
+      </w:r>
+    </w:p>
+    <w:p>
+      <w:pPr>
+        <w:pStyle w:val="Compact"/>
+        <w:numPr>
+          <w:ilvl w:val="1"/>
+          <w:numId w:val="1012"/>
+        </w:numPr>
+      </w:pPr>
+      <w:r>
+        <w:t xml:space="preserve">Text fields: the latest submission wins.</w:t>
+      </w:r>
+    </w:p>
+    <w:p>
+      <w:pPr>
+        <w:pStyle w:val="Compact"/>
+        <w:numPr>
+          <w:ilvl w:val="1"/>
+          <w:numId w:val="1012"/>
+        </w:numPr>
+      </w:pPr>
+      <w:r>
+        <w:t xml:space="preserve">Membership flags (</w:t>
+      </w:r>
+      <w:r>
+        <w:rPr>
+          <w:rStyle w:val="VerbatimChar"/>
+        </w:rPr>
+        <w:t xml:space="preserve">CAS_Member</w:t>
+      </w:r>
+      <w:r>
+        <w:t xml:space="preserve">,</w:t>
+      </w:r>
+      <w:r>
+        <w:t xml:space="preserve"> </w:t>
+      </w:r>
+      <w:r>
+        <w:rPr>
+          <w:rStyle w:val="VerbatimChar"/>
+        </w:rPr>
+        <w:t xml:space="preserve">CANN_Member</w:t>
+      </w:r>
+      <w:r>
+        <w:t xml:space="preserve">):</w:t>
+      </w:r>
+      <w:r>
+        <w:t xml:space="preserve"> </w:t>
+      </w:r>
+      <w:r>
+        <w:rPr>
+          <w:b/>
+          <w:bCs/>
+        </w:rPr>
+        <w:t xml:space="preserve">upgrade-only</w:t>
+      </w:r>
+      <w:r>
+        <w:t xml:space="preserve"> </w:t>
+      </w:r>
+      <w:r>
+        <w:t xml:space="preserve">— once</w:t>
+      </w:r>
+      <w:r>
+        <w:t xml:space="preserve"> </w:t>
+      </w:r>
+      <w:r>
+        <w:rPr>
+          <w:rStyle w:val="VerbatimChar"/>
+        </w:rPr>
+        <w:t xml:space="preserve">true</w:t>
+      </w:r>
+      <w:r>
+        <w:t xml:space="preserve">, they are never reverted to</w:t>
+      </w:r>
+      <w:r>
+        <w:t xml:space="preserve"> </w:t>
+      </w:r>
+      <w:r>
+        <w:rPr>
+          <w:rStyle w:val="VerbatimChar"/>
+        </w:rPr>
+        <w:t xml:space="preserve">false</w:t>
+      </w:r>
+      <w:r>
+        <w:t xml:space="preserve"> </w:t>
+      </w:r>
+      <w:r>
+        <w:t xml:space="preserve">by a later submission.</w:t>
       </w:r>
     </w:p>
     <w:bookmarkEnd w:id="33"/>
+    <w:bookmarkStart w:id="34" w:name="data-protection-privacy-compliance"/>
+    <w:p>
+      <w:pPr>
+        <w:pStyle w:val="Heading2"/>
+      </w:pPr>
+      <w:r>
+        <w:t xml:space="preserve">2.6 Data protection, privacy &amp; compliance</w:t>
+      </w:r>
+    </w:p>
+    <w:p>
+      <w:pPr>
+        <w:pStyle w:val="Compact"/>
+        <w:numPr>
+          <w:ilvl w:val="0"/>
+          <w:numId w:val="1013"/>
+        </w:numPr>
+      </w:pPr>
+      <w:r>
+        <w:rPr>
+          <w:b/>
+          <w:bCs/>
+        </w:rPr>
+        <w:t xml:space="preserve">Validation</w:t>
+      </w:r>
+      <w:r>
+        <w:t xml:space="preserve">: form input is validated server-side (Zod schemas) before storage — malformed submissions are rejected with clear errors, never silently altered.</w:t>
+      </w:r>
+    </w:p>
+    <w:p>
+      <w:pPr>
+        <w:pStyle w:val="Compact"/>
+        <w:numPr>
+          <w:ilvl w:val="0"/>
+          <w:numId w:val="1013"/>
+        </w:numPr>
+      </w:pPr>
+      <w:r>
+        <w:rPr>
+          <w:b/>
+          <w:bCs/>
+        </w:rPr>
+        <w:t xml:space="preserve">Transport security</w:t>
+      </w:r>
+      <w:r>
+        <w:t xml:space="preserve">: the visitor-facing form communicates over HTTPS only.</w:t>
+      </w:r>
+    </w:p>
+    <w:p>
+      <w:pPr>
+        <w:pStyle w:val="Compact"/>
+        <w:numPr>
+          <w:ilvl w:val="0"/>
+          <w:numId w:val="1013"/>
+        </w:numPr>
+      </w:pPr>
+      <w:r>
+        <w:rPr>
+          <w:b/>
+          <w:bCs/>
+        </w:rPr>
+        <w:t xml:space="preserve">Credential handling</w:t>
+      </w:r>
+      <w:r>
+        <w:t xml:space="preserve">: the Zoho connection uses OAuth 2.0 (Self Client). Credentials are stored as server-side environment secrets, never in the codebase or browser.</w:t>
+      </w:r>
+    </w:p>
+    <w:p>
+      <w:pPr>
+        <w:pStyle w:val="Compact"/>
+        <w:numPr>
+          <w:ilvl w:val="0"/>
+          <w:numId w:val="1013"/>
+        </w:numPr>
+      </w:pPr>
+      <w:r>
+        <w:rPr>
+          <w:b/>
+          <w:bCs/>
+        </w:rPr>
+        <w:t xml:space="preserve">Audit trail</w:t>
+      </w:r>
+      <w:r>
+        <w:t xml:space="preserve">: the local PostgreSQL copy provides a permanent record of every submission, its timestamps, and its sync outcome.</w:t>
+      </w:r>
+    </w:p>
+    <w:p>
+      <w:pPr>
+        <w:pStyle w:val="Compact"/>
+        <w:numPr>
+          <w:ilvl w:val="0"/>
+          <w:numId w:val="1013"/>
+        </w:numPr>
+      </w:pPr>
+      <w:r>
+        <w:rPr>
+          <w:b/>
+          <w:bCs/>
+        </w:rPr>
+        <w:t xml:space="preserve">CASL (Canada’s Anti-Spam Legislation)</w:t>
+      </w:r>
+      <w:r>
+        <w:t xml:space="preserve">: express consent for electronic communications is collected via the consent checkbox and stored as explicit</w:t>
+      </w:r>
+      <w:r>
+        <w:t xml:space="preserve"> </w:t>
+      </w:r>
+      <w:r>
+        <w:t xml:space="preserve">“</w:t>
+      </w:r>
+      <w:r>
+        <w:t xml:space="preserve">Yes</w:t>
+      </w:r>
+      <w:r>
+        <w:t xml:space="preserve">”</w:t>
+      </w:r>
+      <w:r>
+        <w:t xml:space="preserve">/</w:t>
+      </w:r>
+      <w:r>
+        <w:t xml:space="preserve">“</w:t>
+      </w:r>
+      <w:r>
+        <w:t xml:space="preserve">No</w:t>
+      </w:r>
+      <w:r>
+        <w:t xml:space="preserve">”</w:t>
+      </w:r>
+      <w:r>
+        <w:t xml:space="preserve"> </w:t>
+      </w:r>
+      <w:r>
+        <w:t xml:space="preserve">values (</w:t>
+      </w:r>
+      <w:r>
+        <w:rPr>
+          <w:rStyle w:val="VerbatimChar"/>
+        </w:rPr>
+        <w:t xml:space="preserve">CAS_Communications</w:t>
+      </w:r>
+      <w:r>
+        <w:t xml:space="preserve">,</w:t>
+      </w:r>
+      <w:r>
+        <w:t xml:space="preserve"> </w:t>
+      </w:r>
+      <w:r>
+        <w:rPr>
+          <w:rStyle w:val="VerbatimChar"/>
+        </w:rPr>
+        <w:t xml:space="preserve">CANN_Communications</w:t>
+      </w:r>
+      <w:r>
+        <w:t xml:space="preserve">) in the CRM. Email campaigns should segment on these fields.</w:t>
+      </w:r>
+    </w:p>
+    <w:p>
+      <w:pPr>
+        <w:pStyle w:val="Compact"/>
+        <w:numPr>
+          <w:ilvl w:val="0"/>
+          <w:numId w:val="1013"/>
+        </w:numPr>
+      </w:pPr>
+      <w:r>
+        <w:rPr>
+          <w:b/>
+          <w:bCs/>
+        </w:rPr>
+        <w:t xml:space="preserve">PIPEDA considerations</w:t>
+      </w:r>
+      <w:r>
+        <w:t xml:space="preserve">: the form collects only the personal information needed for membership administration and the public Services Map (which is opt-in). Individuals who wish to access, correct, or delete their data can be handled by locating their record by email in Zoho and, if required, the local</w:t>
+      </w:r>
+      <w:r>
+        <w:t xml:space="preserve"> </w:t>
+      </w:r>
+      <w:r>
+        <w:rPr>
+          <w:rStyle w:val="VerbatimChar"/>
+        </w:rPr>
+        <w:t xml:space="preserve">form_submissions</w:t>
+      </w:r>
+      <w:r>
+        <w:t xml:space="preserve"> </w:t>
+      </w:r>
+      <w:r>
+        <w:t xml:space="preserve">table.</w:t>
+      </w:r>
+    </w:p>
     <w:bookmarkEnd w:id="34"/>
+    <w:bookmarkStart w:id="35" w:name="admin-tools-data-remediation"/>
+    <w:p>
+      <w:pPr>
+        <w:pStyle w:val="Heading2"/>
+      </w:pPr>
+      <w:r>
+        <w:t xml:space="preserve">2.7 Admin tools &amp; data remediation</w:t>
+      </w:r>
+    </w:p>
+    <w:p>
+      <w:pPr>
+        <w:pStyle w:val="FirstParagraph"/>
+      </w:pPr>
+      <w:r>
+        <w:t xml:space="preserve">The system includes administrative endpoints for maintaining CRM data quality:</w:t>
+      </w:r>
+    </w:p>
+    <w:tbl>
+      <w:tblPr>
+        <w:tblStyle w:val="Table"/>
+        <w:tblW w:type="pct" w:w="5000"/>
+        <w:jc w:val="left"/>
+        <w:tblLayout w:type="fixed"/>
+        <w:tblLook w:firstRow="1" w:lastRow="0" w:firstColumn="0" w:lastColumn="0" w:noHBand="0" w:noVBand="0" w:val="0020"/>
+      </w:tblPr>
+      <w:tblGrid>
+        <w:gridCol w:w="2376"/>
+        <w:gridCol w:w="5544"/>
+      </w:tblGrid>
+      <w:tr>
+        <w:trPr>
+          <w:tblHeader w:val="on"/>
+        </w:trPr>
+        <w:tc>
+          <w:tcPr/>
+          <w:p>
+            <w:pPr>
+              <w:pStyle w:val="Compact"/>
+              <w:jc w:val="left"/>
+            </w:pPr>
+            <w:r>
+              <w:t xml:space="preserve">Tool</w:t>
+            </w:r>
+          </w:p>
+        </w:tc>
+        <w:tc>
+          <w:tcPr/>
+          <w:p>
+            <w:pPr>
+              <w:pStyle w:val="Compact"/>
+              <w:jc w:val="left"/>
+            </w:pPr>
+            <w:r>
+              <w:t xml:space="preserve">What it does</w:t>
+            </w:r>
+          </w:p>
+        </w:tc>
+      </w:tr>
+      <w:tr>
+        <w:tc>
+          <w:tcPr/>
+          <w:p>
+            <w:pPr>
+              <w:pStyle w:val="Compact"/>
+              <w:jc w:val="left"/>
+            </w:pPr>
+            <w:r>
+              <w:rPr>
+                <w:b/>
+                <w:bCs/>
+              </w:rPr>
+              <w:t xml:space="preserve">Fix membership dependencies</w:t>
+            </w:r>
+            <w:r>
+              <w:t xml:space="preserve"> </w:t>
+            </w:r>
+            <w:r>
+              <w:t xml:space="preserve">(</w:t>
+            </w:r>
+            <w:r>
+              <w:rPr>
+                <w:rStyle w:val="VerbatimChar"/>
+              </w:rPr>
+              <w:t xml:space="preserve">POST /api/admin/zoho/fix-membership-dependencies</w:t>
+            </w:r>
+            <w:r>
+              <w:t xml:space="preserve">)</w:t>
+            </w:r>
+          </w:p>
+        </w:tc>
+        <w:tc>
+          <w:tcPr/>
+          <w:p>
+            <w:pPr>
+              <w:pStyle w:val="Compact"/>
+              <w:jc w:val="left"/>
+            </w:pPr>
+            <w:r>
+              <w:t xml:space="preserve">Scans existing Zoho records for CANN→CAS rule violations (CANN member not flagged as CAS member) and for records missing</w:t>
+            </w:r>
+            <w:r>
+              <w:t xml:space="preserve"> </w:t>
+            </w:r>
+            <w:r>
+              <w:rPr>
+                <w:rStyle w:val="VerbatimChar"/>
+              </w:rPr>
+              <w:t xml:space="preserve">Record_Type</w:t>
+            </w:r>
+            <w:r>
+              <w:t xml:space="preserve">. Fixes contradictory states and back-fills the classification on historical records. Supports a</w:t>
+            </w:r>
+            <w:r>
+              <w:t xml:space="preserve"> </w:t>
+            </w:r>
+            <w:r>
+              <w:rPr>
+                <w:b/>
+                <w:bCs/>
+              </w:rPr>
+              <w:t xml:space="preserve">dry-run mode</w:t>
+            </w:r>
+            <w:r>
+              <w:t xml:space="preserve"> </w:t>
+            </w:r>
+            <w:r>
+              <w:t xml:space="preserve">that reports what would change without changing anything.</w:t>
+            </w:r>
+          </w:p>
+        </w:tc>
+      </w:tr>
+      <w:tr>
+        <w:tc>
+          <w:tcPr/>
+          <w:p>
+            <w:pPr>
+              <w:pStyle w:val="Compact"/>
+              <w:jc w:val="left"/>
+            </w:pPr>
+            <w:r>
+              <w:rPr>
+                <w:b/>
+                <w:bCs/>
+              </w:rPr>
+              <w:t xml:space="preserve">Re-sync orphans</w:t>
+            </w:r>
+          </w:p>
+        </w:tc>
+        <w:tc>
+          <w:tcPr/>
+          <w:p>
+            <w:pPr>
+              <w:pStyle w:val="Compact"/>
+              <w:jc w:val="left"/>
+            </w:pPr>
+            <w:r>
+              <w:t xml:space="preserve">Finds submissions saved locally that never reached Zoho and pushes them through the centralized mapping again.</w:t>
+            </w:r>
+          </w:p>
+        </w:tc>
+      </w:tr>
+      <w:tr>
+        <w:tc>
+          <w:tcPr/>
+          <w:p>
+            <w:pPr>
+              <w:pStyle w:val="Compact"/>
+              <w:jc w:val="left"/>
+            </w:pPr>
+            <w:r>
+              <w:rPr>
+                <w:b/>
+                <w:bCs/>
+              </w:rPr>
+              <w:t xml:space="preserve">Batch update</w:t>
+            </w:r>
+          </w:p>
+        </w:tc>
+        <w:tc>
+          <w:tcPr/>
+          <w:p>
+            <w:pPr>
+              <w:pStyle w:val="Compact"/>
+              <w:jc w:val="left"/>
+            </w:pPr>
+            <w:r>
+              <w:t xml:space="preserve">Applies the centralized field mapping and business rules to a batch of existing records — useful after mapping rules change.</w:t>
+            </w:r>
+          </w:p>
+        </w:tc>
+      </w:tr>
+    </w:tbl>
+    <w:p>
+      <w:pPr>
+        <w:pStyle w:val="BodyText"/>
+      </w:pPr>
+      <w:r>
+        <w:t xml:space="preserve">All three tools route through the same</w:t>
+      </w:r>
+      <w:r>
+        <w:t xml:space="preserve"> </w:t>
+      </w:r>
+      <w:r>
+        <w:rPr>
+          <w:rStyle w:val="VerbatimChar"/>
+        </w:rPr>
+        <w:t xml:space="preserve">buildCentralizedZohoData()</w:t>
+      </w:r>
+      <w:r>
+        <w:t xml:space="preserve"> </w:t>
+      </w:r>
+      <w:r>
+        <w:t xml:space="preserve">function, so business rules are applied identically no matter how a record reaches Zoho.</w:t>
+      </w:r>
+    </w:p>
+    <w:bookmarkEnd w:id="35"/>
+    <w:bookmarkStart w:id="36" w:name="troubleshooting-faq-for-administrators"/>
+    <w:p>
+      <w:pPr>
+        <w:pStyle w:val="Heading2"/>
+      </w:pPr>
+      <w:r>
+        <w:t xml:space="preserve">2.8 Troubleshooting &amp; FAQ (for administrators)</w:t>
+      </w:r>
+    </w:p>
+    <w:p>
+      <w:pPr>
+        <w:pStyle w:val="FirstParagraph"/>
+      </w:pPr>
+      <w:r>
+        <w:rPr>
+          <w:b/>
+          <w:bCs/>
+        </w:rPr>
+        <w:t xml:space="preserve">Q: A person says they submitted the form, but I can’t find them in Zoho.</w:t>
+      </w:r>
+      <w:r>
+        <w:t xml:space="preserve"> </w:t>
+      </w:r>
+      <w:r>
+        <w:t xml:space="preserve">Check in this order: (1) Search Zoho Leads by their email — they may exist under a different spelling. (2) The sync may still be retrying — check the</w:t>
+      </w:r>
+      <w:r>
+        <w:t xml:space="preserve"> </w:t>
+      </w:r>
+      <w:r>
+        <w:rPr>
+          <w:rStyle w:val="VerbatimChar"/>
+        </w:rPr>
+        <w:t xml:space="preserve">form_submissions</w:t>
+      </w:r>
+      <w:r>
+        <w:t xml:space="preserve"> </w:t>
+      </w:r>
+      <w:r>
+        <w:t xml:space="preserve">table for their record and its</w:t>
+      </w:r>
+      <w:r>
+        <w:t xml:space="preserve"> </w:t>
+      </w:r>
+      <w:r>
+        <w:rPr>
+          <w:rStyle w:val="VerbatimChar"/>
+        </w:rPr>
+        <w:t xml:space="preserve">syncStatus</w:t>
+      </w:r>
+      <w:r>
+        <w:t xml:space="preserve">/</w:t>
+      </w:r>
+      <w:r>
+        <w:rPr>
+          <w:rStyle w:val="VerbatimChar"/>
+        </w:rPr>
+        <w:t xml:space="preserve">retryCount</w:t>
+      </w:r>
+      <w:r>
+        <w:t xml:space="preserve">. (3) If</w:t>
+      </w:r>
+      <w:r>
+        <w:t xml:space="preserve"> </w:t>
+      </w:r>
+      <w:r>
+        <w:rPr>
+          <w:rStyle w:val="VerbatimChar"/>
+        </w:rPr>
+        <w:t xml:space="preserve">processingStatus</w:t>
+      </w:r>
+      <w:r>
+        <w:t xml:space="preserve"> </w:t>
+      </w:r>
+      <w:r>
+        <w:t xml:space="preserve">is</w:t>
+      </w:r>
+      <w:r>
+        <w:t xml:space="preserve"> </w:t>
+      </w:r>
+      <w:r>
+        <w:rPr>
+          <w:rStyle w:val="VerbatimChar"/>
+        </w:rPr>
+        <w:t xml:space="preserve">failed</w:t>
+      </w:r>
+      <w:r>
+        <w:t xml:space="preserve"> </w:t>
+      </w:r>
+      <w:r>
+        <w:t xml:space="preserve">after 50 attempts, the submission is safe in the local database and can be re-synced with the re-sync tool.</w:t>
+      </w:r>
+    </w:p>
+    <w:p>
+      <w:pPr>
+        <w:pStyle w:val="BodyText"/>
+      </w:pPr>
+      <w:r>
+        <w:rPr>
+          <w:b/>
+          <w:bCs/>
+        </w:rPr>
+        <w:t xml:space="preserve">Q: Zoho was down for a day. Did we lose submissions?</w:t>
+      </w:r>
+      <w:r>
+        <w:t xml:space="preserve"> </w:t>
+      </w:r>
+      <w:r>
+        <w:t xml:space="preserve">No. Every submission is saved locally first. The sync worker retries automatically for roughly 4 days, and a re-queue job rescues anything stuck. Once Zoho recovers, pending submissions flow through on their own — no action needed.</w:t>
+      </w:r>
+    </w:p>
+    <w:p>
+      <w:pPr>
+        <w:pStyle w:val="BodyText"/>
+      </w:pPr>
+      <w:r>
+        <w:rPr>
+          <w:b/>
+          <w:bCs/>
+        </w:rPr>
+        <w:t xml:space="preserve">Q: There’s a duplicate person in Zoho. How did that happen?</w:t>
+      </w:r>
+      <w:r>
+        <w:t xml:space="preserve"> </w:t>
+      </w:r>
+      <w:r>
+        <w:t xml:space="preserve">Dedupe matches on the</w:t>
+      </w:r>
+      <w:r>
+        <w:t xml:space="preserve"> </w:t>
+      </w:r>
+      <w:r>
+        <w:rPr>
+          <w:rStyle w:val="VerbatimChar"/>
+        </w:rPr>
+        <w:t xml:space="preserve">Email</w:t>
+      </w:r>
+      <w:r>
+        <w:t xml:space="preserve"> </w:t>
+      </w:r>
+      <w:r>
+        <w:t xml:space="preserve">field. Duplicates typically mean the person used two different email addresses. Merge them in Zoho; the membership flags follow upgrade-only logic, so keep whichever flags are</w:t>
+      </w:r>
+      <w:r>
+        <w:t xml:space="preserve"> </w:t>
+      </w:r>
+      <w:r>
+        <w:rPr>
+          <w:rStyle w:val="VerbatimChar"/>
+        </w:rPr>
+        <w:t xml:space="preserve">true</w:t>
+      </w:r>
+      <w:r>
+        <w:t xml:space="preserve">.</w:t>
+      </w:r>
+    </w:p>
+    <w:p>
+      <w:pPr>
+        <w:pStyle w:val="BodyText"/>
+      </w:pPr>
+      <w:r>
+        <w:rPr>
+          <w:b/>
+          <w:bCs/>
+        </w:rPr>
+        <w:t xml:space="preserve">Q: A CANN member shows</w:t>
+      </w:r>
+      <w:r>
+        <w:rPr>
+          <w:b/>
+          <w:bCs/>
+        </w:rPr>
+        <w:t xml:space="preserve"> </w:t>
+      </w:r>
+      <w:r>
+        <w:rPr>
+          <w:rStyle w:val="VerbatimChar"/>
+          <w:b/>
+          <w:bCs/>
+        </w:rPr>
+        <w:t xml:space="preserve">CAS_Member = false</w:t>
+      </w:r>
+      <w:r>
+        <w:rPr>
+          <w:b/>
+          <w:bCs/>
+        </w:rPr>
+        <w:t xml:space="preserve"> </w:t>
+      </w:r>
+      <w:r>
+        <w:rPr>
+          <w:b/>
+          <w:bCs/>
+        </w:rPr>
+        <w:t xml:space="preserve">in Zoho.</w:t>
+      </w:r>
+      <w:r>
+        <w:t xml:space="preserve"> </w:t>
+      </w:r>
+      <w:r>
+        <w:t xml:space="preserve">This violates the CANN→CAS rule — usually a legacy record from before the rule existed. Run the</w:t>
+      </w:r>
+      <w:r>
+        <w:t xml:space="preserve"> </w:t>
+      </w:r>
+      <w:r>
+        <w:rPr>
+          <w:b/>
+          <w:bCs/>
+        </w:rPr>
+        <w:t xml:space="preserve">fix membership dependencies</w:t>
+      </w:r>
+      <w:r>
+        <w:t xml:space="preserve"> </w:t>
+      </w:r>
+      <w:r>
+        <w:t xml:space="preserve">tool (dry-run first) to correct it and any others.</w:t>
+      </w:r>
+    </w:p>
+    <w:p>
+      <w:pPr>
+        <w:pStyle w:val="BodyText"/>
+      </w:pPr>
+      <w:r>
+        <w:rPr>
+          <w:b/>
+          <w:bCs/>
+        </w:rPr>
+        <w:t xml:space="preserve">Q: Someone asked to stop receiving emails.</w:t>
+      </w:r>
+      <w:r>
+        <w:t xml:space="preserve"> </w:t>
+      </w:r>
+      <w:r>
+        <w:t xml:space="preserve">Set</w:t>
+      </w:r>
+      <w:r>
+        <w:t xml:space="preserve"> </w:t>
+      </w:r>
+      <w:r>
+        <w:rPr>
+          <w:rStyle w:val="VerbatimChar"/>
+        </w:rPr>
+        <w:t xml:space="preserve">CAS_Communications</w:t>
+      </w:r>
+      <w:r>
+        <w:t xml:space="preserve"> </w:t>
+      </w:r>
+      <w:r>
+        <w:t xml:space="preserve">and/or</w:t>
+      </w:r>
+      <w:r>
+        <w:t xml:space="preserve"> </w:t>
+      </w:r>
+      <w:r>
+        <w:rPr>
+          <w:rStyle w:val="VerbatimChar"/>
+        </w:rPr>
+        <w:t xml:space="preserve">CANN_Communications</w:t>
+      </w:r>
+      <w:r>
+        <w:t xml:space="preserve"> </w:t>
+      </w:r>
+      <w:r>
+        <w:t xml:space="preserve">to</w:t>
+      </w:r>
+      <w:r>
+        <w:t xml:space="preserve"> </w:t>
+      </w:r>
+      <w:r>
+        <w:t xml:space="preserve">“</w:t>
+      </w:r>
+      <w:r>
+        <w:t xml:space="preserve">No</w:t>
+      </w:r>
+      <w:r>
+        <w:t xml:space="preserve">”</w:t>
+      </w:r>
+      <w:r>
+        <w:t xml:space="preserve"> </w:t>
+      </w:r>
+      <w:r>
+        <w:t xml:space="preserve">on their Zoho record, and honour the change in campaign segments. The original consent record remains in the local database for CASL audit purposes.</w:t>
+      </w:r>
+    </w:p>
+    <w:p>
+      <w:pPr>
+        <w:pStyle w:val="BodyText"/>
+      </w:pPr>
+      <w:r>
+        <w:rPr>
+          <w:b/>
+          <w:bCs/>
+        </w:rPr>
+        <w:t xml:space="preserve">Q: We renamed or added a field in Zoho. What needs updating?</w:t>
+      </w:r>
+      <w:r>
+        <w:t xml:space="preserve"> </w:t>
+      </w:r>
+      <w:r>
+        <w:t xml:space="preserve">Field mapping lives in</w:t>
+      </w:r>
+      <w:r>
+        <w:t xml:space="preserve"> </w:t>
+      </w:r>
+      <w:r>
+        <w:rPr>
+          <w:rStyle w:val="VerbatimChar"/>
+        </w:rPr>
+        <w:t xml:space="preserve">buildCentralizedZohoData()</w:t>
+      </w:r>
+      <w:r>
+        <w:t xml:space="preserve"> </w:t>
+      </w:r>
+      <w:r>
+        <w:t xml:space="preserve">in</w:t>
+      </w:r>
+      <w:r>
+        <w:t xml:space="preserve"> </w:t>
+      </w:r>
+      <w:r>
+        <w:rPr>
+          <w:rStyle w:val="VerbatimChar"/>
+        </w:rPr>
+        <w:t xml:space="preserve">server/zoho-crm-service.ts</w:t>
+      </w:r>
+      <w:r>
+        <w:t xml:space="preserve">. Any new/renamed CRM field must be updated there (and in this document). Note: renaming a Zoho picklist value does</w:t>
+      </w:r>
+      <w:r>
+        <w:t xml:space="preserve"> </w:t>
+      </w:r>
+      <w:r>
+        <w:rPr>
+          <w:b/>
+          <w:bCs/>
+        </w:rPr>
+        <w:t xml:space="preserve">not</w:t>
+      </w:r>
+      <w:r>
+        <w:t xml:space="preserve"> </w:t>
+      </w:r>
+      <w:r>
+        <w:t xml:space="preserve">update existing records — old values remain until remediated.</w:t>
+      </w:r>
+    </w:p>
+    <w:bookmarkEnd w:id="36"/>
+    <w:bookmarkStart w:id="37" w:name="change-management"/>
+    <w:p>
+      <w:pPr>
+        <w:pStyle w:val="Heading2"/>
+      </w:pPr>
+      <w:r>
+        <w:t xml:space="preserve">2.9 Change management</w:t>
+      </w:r>
+    </w:p>
+    <w:p>
+      <w:pPr>
+        <w:pStyle w:val="FirstParagraph"/>
+      </w:pPr>
+      <w:r>
+        <w:t xml:space="preserve">When any of the following change, this document must be updated and the mapping code reviewed:</w:t>
+      </w:r>
+    </w:p>
+    <w:p>
+      <w:pPr>
+        <w:pStyle w:val="Compact"/>
+        <w:numPr>
+          <w:ilvl w:val="0"/>
+          <w:numId w:val="1014"/>
+        </w:numPr>
+      </w:pPr>
+      <w:r>
+        <w:t xml:space="preserve">Form fields added, removed, or renamed on</w:t>
+      </w:r>
+      <w:r>
+        <w:t xml:space="preserve"> </w:t>
+      </w:r>
+      <w:r>
+        <w:rPr>
+          <w:rStyle w:val="VerbatimChar"/>
+        </w:rPr>
+        <w:t xml:space="preserve">/join-cas</w:t>
+      </w:r>
+    </w:p>
+    <w:p>
+      <w:pPr>
+        <w:pStyle w:val="Compact"/>
+        <w:numPr>
+          <w:ilvl w:val="0"/>
+          <w:numId w:val="1014"/>
+        </w:numPr>
+      </w:pPr>
+      <w:r>
+        <w:t xml:space="preserve">Zoho CRM custom fields or picklist values changed</w:t>
+      </w:r>
+    </w:p>
+    <w:p>
+      <w:pPr>
+        <w:pStyle w:val="Compact"/>
+        <w:numPr>
+          <w:ilvl w:val="0"/>
+          <w:numId w:val="1014"/>
+        </w:numPr>
+      </w:pPr>
+      <w:r>
+        <w:t xml:space="preserve">Business rules (membership dependency, classification, lead sources) revised</w:t>
+      </w:r>
+    </w:p>
+    <w:p>
+      <w:pPr>
+        <w:pStyle w:val="Compact"/>
+        <w:numPr>
+          <w:ilvl w:val="0"/>
+          <w:numId w:val="1014"/>
+        </w:numPr>
+      </w:pPr>
+      <w:r>
+        <w:t xml:space="preserve">Consent wording or CASL practices updated</w:t>
+      </w:r>
+    </w:p>
+    <w:p>
+      <w:r>
+        <w:pict>
+          <v:rect style="width:0;height:1.5pt" o:hralign="center" o:hrstd="t" o:hr="t"/>
+        </w:pict>
+      </w:r>
+    </w:p>
+    <w:bookmarkEnd w:id="37"/>
+    <w:bookmarkEnd w:id="38"/>
+    <w:bookmarkStart w:id="39" w:name="glossary"/>
+    <w:p>
+      <w:pPr>
+        <w:pStyle w:val="Heading1"/>
+      </w:pPr>
+      <w:r>
+        <w:t xml:space="preserve">Glossary</w:t>
+      </w:r>
+    </w:p>
+    <w:tbl>
+      <w:tblPr>
+        <w:tblStyle w:val="Table"/>
+        <w:tblW w:type="pct" w:w="5000"/>
+        <w:jc w:val="left"/>
+        <w:tblLayout w:type="fixed"/>
+        <w:tblLook w:firstRow="1" w:lastRow="0" w:firstColumn="0" w:lastColumn="0" w:noHBand="0" w:noVBand="0" w:val="0020"/>
+      </w:tblPr>
+      <w:tblGrid>
+        <w:gridCol w:w="3168"/>
+        <w:gridCol w:w="4752"/>
+      </w:tblGrid>
+      <w:tr>
+        <w:trPr>
+          <w:tblHeader w:val="on"/>
+        </w:trPr>
+        <w:tc>
+          <w:tcPr/>
+          <w:p>
+            <w:pPr>
+              <w:pStyle w:val="Compact"/>
+              <w:jc w:val="left"/>
+            </w:pPr>
+            <w:r>
+              <w:t xml:space="preserve">Term</w:t>
+            </w:r>
+          </w:p>
+        </w:tc>
+        <w:tc>
+          <w:tcPr/>
+          <w:p>
+            <w:pPr>
+              <w:pStyle w:val="Compact"/>
+              <w:jc w:val="left"/>
+            </w:pPr>
+            <w:r>
+              <w:t xml:space="preserve">Meaning</w:t>
+            </w:r>
+          </w:p>
+        </w:tc>
+      </w:tr>
+      <w:tr>
+        <w:tc>
+          <w:tcPr/>
+          <w:p>
+            <w:pPr>
+              <w:pStyle w:val="Compact"/>
+              <w:jc w:val="left"/>
+            </w:pPr>
+            <w:r>
+              <w:rPr>
+                <w:b/>
+                <w:bCs/>
+              </w:rPr>
+              <w:t xml:space="preserve">CAS</w:t>
+            </w:r>
+          </w:p>
+        </w:tc>
+        <w:tc>
+          <w:tcPr/>
+          <w:p>
+            <w:pPr>
+              <w:pStyle w:val="Compact"/>
+              <w:jc w:val="left"/>
+            </w:pPr>
+            <w:r>
+              <w:t xml:space="preserve">Canadian Amyloidosis Society</w:t>
+            </w:r>
+          </w:p>
+        </w:tc>
+      </w:tr>
+      <w:tr>
+        <w:tc>
+          <w:tcPr/>
+          <w:p>
+            <w:pPr>
+              <w:pStyle w:val="Compact"/>
+              <w:jc w:val="left"/>
+            </w:pPr>
+            <w:r>
+              <w:rPr>
+                <w:b/>
+                <w:bCs/>
+              </w:rPr>
+              <w:t xml:space="preserve">CANN</w:t>
+            </w:r>
+          </w:p>
+        </w:tc>
+        <w:tc>
+          <w:tcPr/>
+          <w:p>
+            <w:pPr>
+              <w:pStyle w:val="Compact"/>
+              <w:jc w:val="left"/>
+            </w:pPr>
+            <w:r>
+              <w:t xml:space="preserve">Canadian Amyloidosis Nursing Network (an affiliate of CAS)</w:t>
+            </w:r>
+          </w:p>
+        </w:tc>
+      </w:tr>
+      <w:tr>
+        <w:tc>
+          <w:tcPr/>
+          <w:p>
+            <w:pPr>
+              <w:pStyle w:val="Compact"/>
+              <w:jc w:val="left"/>
+            </w:pPr>
+            <w:r>
+              <w:rPr>
+                <w:b/>
+                <w:bCs/>
+              </w:rPr>
+              <w:t xml:space="preserve">CRM</w:t>
+            </w:r>
+          </w:p>
+        </w:tc>
+        <w:tc>
+          <w:tcPr/>
+          <w:p>
+            <w:pPr>
+              <w:pStyle w:val="Compact"/>
+              <w:jc w:val="left"/>
+            </w:pPr>
+            <w:r>
+              <w:t xml:space="preserve">Customer Relationship Management system — here, Zoho CRM, where member records are managed</w:t>
+            </w:r>
+          </w:p>
+        </w:tc>
+      </w:tr>
+      <w:tr>
+        <w:tc>
+          <w:tcPr/>
+          <w:p>
+            <w:pPr>
+              <w:pStyle w:val="Compact"/>
+              <w:jc w:val="left"/>
+            </w:pPr>
+            <w:r>
+              <w:rPr>
+                <w:b/>
+                <w:bCs/>
+              </w:rPr>
+              <w:t xml:space="preserve">Lead</w:t>
+            </w:r>
+          </w:p>
+        </w:tc>
+        <w:tc>
+          <w:tcPr/>
+          <w:p>
+            <w:pPr>
+              <w:pStyle w:val="Compact"/>
+              <w:jc w:val="left"/>
+            </w:pPr>
+            <w:r>
+              <w:t xml:space="preserve">Zoho’s name for a contact record in the Leads module; every form submission becomes or updates a Lead</w:t>
+            </w:r>
+          </w:p>
+        </w:tc>
+      </w:tr>
+      <w:tr>
+        <w:tc>
+          <w:tcPr/>
+          <w:p>
+            <w:pPr>
+              <w:pStyle w:val="Compact"/>
+              <w:jc w:val="left"/>
+            </w:pPr>
+            <w:r>
+              <w:rPr>
+                <w:b/>
+                <w:bCs/>
+              </w:rPr>
+              <w:t xml:space="preserve">Sync</w:t>
+            </w:r>
+          </w:p>
+        </w:tc>
+        <w:tc>
+          <w:tcPr/>
+          <w:p>
+            <w:pPr>
+              <w:pStyle w:val="Compact"/>
+              <w:jc w:val="left"/>
+            </w:pPr>
+            <w:r>
+              <w:t xml:space="preserve">The automatic transfer of a submission from the website’s database to Zoho CRM</w:t>
+            </w:r>
+          </w:p>
+        </w:tc>
+      </w:tr>
+      <w:tr>
+        <w:tc>
+          <w:tcPr/>
+          <w:p>
+            <w:pPr>
+              <w:pStyle w:val="Compact"/>
+              <w:jc w:val="left"/>
+            </w:pPr>
+            <w:r>
+              <w:rPr>
+                <w:b/>
+                <w:bCs/>
+              </w:rPr>
+              <w:t xml:space="preserve">Upsert</w:t>
+            </w:r>
+          </w:p>
+        </w:tc>
+        <w:tc>
+          <w:tcPr/>
+          <w:p>
+            <w:pPr>
+              <w:pStyle w:val="Compact"/>
+              <w:jc w:val="left"/>
+            </w:pPr>
+            <w:r>
+              <w:t xml:space="preserve">“</w:t>
+            </w:r>
+            <w:r>
+              <w:t xml:space="preserve">Update or insert</w:t>
+            </w:r>
+            <w:r>
+              <w:t xml:space="preserve">”</w:t>
+            </w:r>
+            <w:r>
+              <w:t xml:space="preserve"> </w:t>
+            </w:r>
+            <w:r>
+              <w:t xml:space="preserve">— update the existing record if one matches, otherwise create a new one</w:t>
+            </w:r>
+          </w:p>
+        </w:tc>
+      </w:tr>
+      <w:tr>
+        <w:tc>
+          <w:tcPr/>
+          <w:p>
+            <w:pPr>
+              <w:pStyle w:val="Compact"/>
+              <w:jc w:val="left"/>
+            </w:pPr>
+            <w:r>
+              <w:rPr>
+                <w:b/>
+                <w:bCs/>
+              </w:rPr>
+              <w:t xml:space="preserve">Dedupe</w:t>
+            </w:r>
+          </w:p>
+        </w:tc>
+        <w:tc>
+          <w:tcPr/>
+          <w:p>
+            <w:pPr>
+              <w:pStyle w:val="Compact"/>
+              <w:jc w:val="left"/>
+            </w:pPr>
+            <w:r>
+              <w:t xml:space="preserve">Duplicate prevention — matching incoming submissions to existing records by email</w:t>
+            </w:r>
+          </w:p>
+        </w:tc>
+      </w:tr>
+      <w:tr>
+        <w:tc>
+          <w:tcPr/>
+          <w:p>
+            <w:pPr>
+              <w:pStyle w:val="Compact"/>
+              <w:jc w:val="left"/>
+            </w:pPr>
+            <w:r>
+              <w:rPr>
+                <w:b/>
+                <w:bCs/>
+              </w:rPr>
+              <w:t xml:space="preserve">OAuth</w:t>
+            </w:r>
+          </w:p>
+        </w:tc>
+        <w:tc>
+          <w:tcPr/>
+          <w:p>
+            <w:pPr>
+              <w:pStyle w:val="Compact"/>
+              <w:jc w:val="left"/>
+            </w:pPr>
+            <w:r>
+              <w:t xml:space="preserve">The secure authorization standard used to connect the website to Zoho without sharing passwords</w:t>
+            </w:r>
+          </w:p>
+        </w:tc>
+      </w:tr>
+      <w:tr>
+        <w:tc>
+          <w:tcPr/>
+          <w:p>
+            <w:pPr>
+              <w:pStyle w:val="Compact"/>
+              <w:jc w:val="left"/>
+            </w:pPr>
+            <w:r>
+              <w:rPr>
+                <w:b/>
+                <w:bCs/>
+              </w:rPr>
+              <w:t xml:space="preserve">API</w:t>
+            </w:r>
+          </w:p>
+        </w:tc>
+        <w:tc>
+          <w:tcPr/>
+          <w:p>
+            <w:pPr>
+              <w:pStyle w:val="Compact"/>
+              <w:jc w:val="left"/>
+            </w:pPr>
+            <w:r>
+              <w:t xml:space="preserve">Application Programming Interface — the channel through which the website talks to Zoho</w:t>
+            </w:r>
+          </w:p>
+        </w:tc>
+      </w:tr>
+      <w:tr>
+        <w:tc>
+          <w:tcPr/>
+          <w:p>
+            <w:pPr>
+              <w:pStyle w:val="Compact"/>
+              <w:jc w:val="left"/>
+            </w:pPr>
+            <w:r>
+              <w:rPr>
+                <w:b/>
+                <w:bCs/>
+              </w:rPr>
+              <w:t xml:space="preserve">CASL</w:t>
+            </w:r>
+          </w:p>
+        </w:tc>
+        <w:tc>
+          <w:tcPr/>
+          <w:p>
+            <w:pPr>
+              <w:pStyle w:val="Compact"/>
+              <w:jc w:val="left"/>
+            </w:pPr>
+            <w:r>
+              <w:t xml:space="preserve">Canada’s Anti-Spam Legislation — requires consent for commercial electronic messages</w:t>
+            </w:r>
+          </w:p>
+        </w:tc>
+      </w:tr>
+      <w:tr>
+        <w:tc>
+          <w:tcPr/>
+          <w:p>
+            <w:pPr>
+              <w:pStyle w:val="Compact"/>
+              <w:jc w:val="left"/>
+            </w:pPr>
+            <w:r>
+              <w:rPr>
+                <w:b/>
+                <w:bCs/>
+              </w:rPr>
+              <w:t xml:space="preserve">PIPEDA</w:t>
+            </w:r>
+          </w:p>
+        </w:tc>
+        <w:tc>
+          <w:tcPr/>
+          <w:p>
+            <w:pPr>
+              <w:pStyle w:val="Compact"/>
+              <w:jc w:val="left"/>
+            </w:pPr>
+            <w:r>
+              <w:t xml:space="preserve">Personal Information Protection and Electronic Documents Act — Canada’s federal privacy law</w:t>
+            </w:r>
+          </w:p>
+        </w:tc>
+      </w:tr>
+      <w:tr>
+        <w:tc>
+          <w:tcPr/>
+          <w:p>
+            <w:pPr>
+              <w:pStyle w:val="Compact"/>
+              <w:jc w:val="left"/>
+            </w:pPr>
+            <w:r>
+              <w:rPr>
+                <w:b/>
+                <w:bCs/>
+              </w:rPr>
+              <w:t xml:space="preserve">PostgreSQL</w:t>
+            </w:r>
+          </w:p>
+        </w:tc>
+        <w:tc>
+          <w:tcPr/>
+          <w:p>
+            <w:pPr>
+              <w:pStyle w:val="Compact"/>
+              <w:jc w:val="left"/>
+            </w:pPr>
+            <w:r>
+              <w:t xml:space="preserve">The database used by the website to store submissions locally</w:t>
+            </w:r>
+          </w:p>
+        </w:tc>
+      </w:tr>
+      <w:tr>
+        <w:tc>
+          <w:tcPr/>
+          <w:p>
+            <w:pPr>
+              <w:pStyle w:val="Compact"/>
+              <w:jc w:val="left"/>
+            </w:pPr>
+            <w:r>
+              <w:rPr>
+                <w:b/>
+                <w:bCs/>
+              </w:rPr>
+              <w:t xml:space="preserve">Backoff</w:t>
+            </w:r>
+          </w:p>
+        </w:tc>
+        <w:tc>
+          <w:tcPr/>
+          <w:p>
+            <w:pPr>
+              <w:pStyle w:val="Compact"/>
+              <w:jc w:val="left"/>
+            </w:pPr>
+            <w:r>
+              <w:t xml:space="preserve">Retry strategy where the wait time between attempts increases progressively</w:t>
+            </w:r>
+          </w:p>
+        </w:tc>
+      </w:tr>
+    </w:tbl>
+    <w:p>
+      <w:r>
+        <w:pict>
+          <v:rect style="width:0;height:1.5pt" o:hralign="center" o:hrstd="t" o:hr="t"/>
+        </w:pict>
+      </w:r>
+    </w:p>
+    <w:bookmarkEnd w:id="39"/>
+    <w:bookmarkStart w:id="40" w:name="document-control"/>
+    <w:p>
+      <w:pPr>
+        <w:pStyle w:val="Heading1"/>
+      </w:pPr>
+      <w:r>
+        <w:t xml:space="preserve">Document control</w:t>
+      </w:r>
+    </w:p>
+    <w:tbl>
+      <w:tblPr>
+        <w:tblStyle w:val="Table"/>
+        <w:tblW w:type="pct" w:w="5000"/>
+        <w:jc w:val="left"/>
+        <w:tblLayout w:type="fixed"/>
+        <w:tblLook w:firstRow="1" w:lastRow="0" w:firstColumn="0" w:lastColumn="0" w:noHBand="0" w:noVBand="0" w:val="0020"/>
+      </w:tblPr>
+      <w:tblGrid>
+        <w:gridCol w:w="3394"/>
+        <w:gridCol w:w="4525"/>
+      </w:tblGrid>
+      <w:tr>
+        <w:trPr>
+          <w:tblHeader w:val="on"/>
+        </w:trPr>
+        <w:tc>
+          <w:tcPr/>
+          <w:p>
+            <w:pPr>
+              <w:pStyle w:val="Compact"/>
+              <w:jc w:val="left"/>
+            </w:pPr>
+            <w:r>
+              <w:t xml:space="preserve">Item</w:t>
+            </w:r>
+          </w:p>
+        </w:tc>
+        <w:tc>
+          <w:tcPr/>
+          <w:p>
+            <w:pPr>
+              <w:pStyle w:val="Compact"/>
+              <w:jc w:val="left"/>
+            </w:pPr>
+            <w:r>
+              <w:t xml:space="preserve">Detail</w:t>
+            </w:r>
+          </w:p>
+        </w:tc>
+      </w:tr>
+      <w:tr>
+        <w:tc>
+          <w:tcPr/>
+          <w:p>
+            <w:pPr>
+              <w:pStyle w:val="Compact"/>
+              <w:jc w:val="left"/>
+            </w:pPr>
+            <w:r>
+              <w:t xml:space="preserve">Document title</w:t>
+            </w:r>
+          </w:p>
+        </w:tc>
+        <w:tc>
+          <w:tcPr/>
+          <w:p>
+            <w:pPr>
+              <w:pStyle w:val="Compact"/>
+              <w:jc w:val="left"/>
+            </w:pPr>
+            <w:r>
+              <w:t xml:space="preserve">CAS Website — Join Form Data Flow Documentation</w:t>
+            </w:r>
+          </w:p>
+        </w:tc>
+      </w:tr>
+      <w:tr>
+        <w:tc>
+          <w:tcPr/>
+          <w:p>
+            <w:pPr>
+              <w:pStyle w:val="Compact"/>
+              <w:jc w:val="left"/>
+            </w:pPr>
+            <w:r>
+              <w:t xml:space="preserve">Version</w:t>
+            </w:r>
+          </w:p>
+        </w:tc>
+        <w:tc>
+          <w:tcPr/>
+          <w:p>
+            <w:pPr>
+              <w:pStyle w:val="Compact"/>
+              <w:jc w:val="left"/>
+            </w:pPr>
+            <w:r>
+              <w:t xml:space="preserve">1.0</w:t>
+            </w:r>
+          </w:p>
+        </w:tc>
+      </w:tr>
+      <w:tr>
+        <w:tc>
+          <w:tcPr/>
+          <w:p>
+            <w:pPr>
+              <w:pStyle w:val="Compact"/>
+              <w:jc w:val="left"/>
+            </w:pPr>
+            <w:r>
+              <w:t xml:space="preserve">Date</w:t>
+            </w:r>
+          </w:p>
+        </w:tc>
+        <w:tc>
+          <w:tcPr/>
+          <w:p>
+            <w:pPr>
+              <w:pStyle w:val="Compact"/>
+              <w:jc w:val="left"/>
+            </w:pPr>
+            <w:r>
+              <w:t xml:space="preserve">July 2026</w:t>
+            </w:r>
+          </w:p>
+        </w:tc>
+      </w:tr>
+      <w:tr>
+        <w:tc>
+          <w:tcPr/>
+          <w:p>
+            <w:pPr>
+              <w:pStyle w:val="Compact"/>
+              <w:jc w:val="left"/>
+            </w:pPr>
+            <w:r>
+              <w:t xml:space="preserve">Scope</w:t>
+            </w:r>
+          </w:p>
+        </w:tc>
+        <w:tc>
+          <w:tcPr/>
+          <w:p>
+            <w:pPr>
+              <w:pStyle w:val="Compact"/>
+              <w:jc w:val="left"/>
+            </w:pPr>
+            <w:r>
+              <w:t xml:space="preserve">Join CAS/CANN form (</w:t>
+            </w:r>
+            <w:r>
+              <w:rPr>
+                <w:rStyle w:val="VerbatimChar"/>
+              </w:rPr>
+              <w:t xml:space="preserve">/join-cas</w:t>
+            </w:r>
+            <w:r>
+              <w:t xml:space="preserve">) → Zoho CRM data flow only</w:t>
+            </w:r>
+          </w:p>
+        </w:tc>
+      </w:tr>
+      <w:tr>
+        <w:tc>
+          <w:tcPr/>
+          <w:p>
+            <w:pPr>
+              <w:pStyle w:val="Compact"/>
+              <w:jc w:val="left"/>
+            </w:pPr>
+            <w:r>
+              <w:t xml:space="preserve">Out of scope</w:t>
+            </w:r>
+          </w:p>
+        </w:tc>
+        <w:tc>
+          <w:tcPr/>
+          <w:p>
+            <w:pPr>
+              <w:pStyle w:val="Compact"/>
+              <w:jc w:val="left"/>
+            </w:pPr>
+            <w:r>
+              <w:t xml:space="preserve">Event registrations, resource uploads, admin bulk imports (documented separately if needed)</w:t>
+            </w:r>
+          </w:p>
+        </w:tc>
+      </w:tr>
+      <w:tr>
+        <w:tc>
+          <w:tcPr/>
+          <w:p>
+            <w:pPr>
+              <w:pStyle w:val="Compact"/>
+              <w:jc w:val="left"/>
+            </w:pPr>
+            <w:r>
+              <w:t xml:space="preserve">Review trigger</w:t>
+            </w:r>
+          </w:p>
+        </w:tc>
+        <w:tc>
+          <w:tcPr/>
+          <w:p>
+            <w:pPr>
+              <w:pStyle w:val="Compact"/>
+              <w:jc w:val="left"/>
+            </w:pPr>
+            <w:r>
+              <w:t xml:space="preserve">Any change listed under</w:t>
+            </w:r>
+            <w:r>
+              <w:t xml:space="preserve"> </w:t>
+            </w:r>
+            <w:r>
+              <w:t xml:space="preserve">“</w:t>
+            </w:r>
+            <w:r>
+              <w:t xml:space="preserve">Change management</w:t>
+            </w:r>
+            <w:r>
+              <w:t xml:space="preserve">”</w:t>
+            </w:r>
+            <w:r>
+              <w:t xml:space="preserve"> </w:t>
+            </w:r>
+            <w:r>
+              <w:t xml:space="preserve">(section 2.9)</w:t>
+            </w:r>
+          </w:p>
+        </w:tc>
+      </w:tr>
+    </w:tbl>
+    <w:p/>
+    <w:tbl>
+      <w:tblPr>
+        <w:tblStyle w:val="Table"/>
+        <w:tblW w:type="auto" w:w="0"/>
+        <w:jc w:val="left"/>
+        <w:tblLook w:firstRow="1" w:lastRow="0" w:firstColumn="0" w:lastColumn="0" w:noHBand="0" w:noVBand="0" w:val="0020"/>
+      </w:tblPr>
+      <w:tblGrid>
+        <w:gridCol w:w="2640"/>
+        <w:gridCol w:w="2640"/>
+        <w:gridCol w:w="2640"/>
+      </w:tblGrid>
+      <w:tr>
+        <w:trPr>
+          <w:tblHeader w:val="on"/>
+        </w:trPr>
+        <w:tc>
+          <w:tcPr/>
+          <w:p>
+            <w:pPr>
+              <w:pStyle w:val="Compact"/>
+              <w:jc w:val="left"/>
+            </w:pPr>
+            <w:r>
+              <w:t xml:space="preserve">Version</w:t>
+            </w:r>
+          </w:p>
+        </w:tc>
+        <w:tc>
+          <w:tcPr/>
+          <w:p>
+            <w:pPr>
+              <w:pStyle w:val="Compact"/>
+              <w:jc w:val="left"/>
+            </w:pPr>
+            <w:r>
+              <w:t xml:space="preserve">Date</w:t>
+            </w:r>
+          </w:p>
+        </w:tc>
+        <w:tc>
+          <w:tcPr/>
+          <w:p>
+            <w:pPr>
+              <w:pStyle w:val="Compact"/>
+              <w:jc w:val="left"/>
+            </w:pPr>
+            <w:r>
+              <w:t xml:space="preserve">Changes</w:t>
+            </w:r>
+          </w:p>
+        </w:tc>
+      </w:tr>
+      <w:tr>
+        <w:tc>
+          <w:tcPr/>
+          <w:p>
+            <w:pPr>
+              <w:pStyle w:val="Compact"/>
+              <w:jc w:val="left"/>
+            </w:pPr>
+            <w:r>
+              <w:t xml:space="preserve">1.0</w:t>
+            </w:r>
+          </w:p>
+        </w:tc>
+        <w:tc>
+          <w:tcPr/>
+          <w:p>
+            <w:pPr>
+              <w:pStyle w:val="Compact"/>
+              <w:jc w:val="left"/>
+            </w:pPr>
+            <w:r>
+              <w:t xml:space="preserve">July 2026</w:t>
+            </w:r>
+          </w:p>
+        </w:tc>
+        <w:tc>
+          <w:tcPr/>
+          <w:p>
+            <w:pPr>
+              <w:pStyle w:val="Compact"/>
+              <w:jc w:val="left"/>
+            </w:pPr>
+            <w:r>
+              <w:t xml:space="preserve">Initial version</w:t>
+            </w:r>
+          </w:p>
+        </w:tc>
+      </w:tr>
+    </w:tbl>
+    <w:bookmarkEnd w:id="40"/>
     <w:sectPr/>
   </w:body>
 </w:document>
@@ -5219,6 +7393,18 @@
     </w:lvlOverride>
   </w:num>
   <w:num w:numId="1004">
+    <w:abstractNumId w:val="991"/>
+  </w:num>
+  <w:num w:numId="1005">
+    <w:abstractNumId w:val="991"/>
+  </w:num>
+  <w:num w:numId="1006">
+    <w:abstractNumId w:val="991"/>
+  </w:num>
+  <w:num w:numId="1007">
+    <w:abstractNumId w:val="991"/>
+  </w:num>
+  <w:num w:numId="1008">
     <w:abstractNumId w:val="99411"/>
     <w:lvlOverride w:ilvl="0">
       <w:startOverride w:val="1"/>
@@ -5248,19 +7434,22 @@
       <w:startOverride w:val="1"/>
     </w:lvlOverride>
   </w:num>
-  <w:num w:numId="1005">
+  <w:num w:numId="1009">
     <w:abstractNumId w:val="991"/>
   </w:num>
-  <w:num w:numId="1006">
+  <w:num w:numId="1010">
     <w:abstractNumId w:val="991"/>
   </w:num>
-  <w:num w:numId="1007">
+  <w:num w:numId="1011">
     <w:abstractNumId w:val="991"/>
   </w:num>
-  <w:num w:numId="1008">
+  <w:num w:numId="1012">
     <w:abstractNumId w:val="991"/>
   </w:num>
-  <w:num w:numId="1009">
+  <w:num w:numId="1013">
+    <w:abstractNumId w:val="991"/>
+  </w:num>
+  <w:num w:numId="1014">
     <w:abstractNumId w:val="991"/>
   </w:num>
 </w:numbering>

</xml_diff>